<commit_message>
Refocus site on Enterprise Infrastructure Capstone
</commit_message>
<xml_diff>
--- a/assets/Yiqin_Huang_Resume_One_Page.docx
+++ b/assets/Yiqin_Huang_Resume_One_Page.docx
@@ -141,31 +141,38 @@
         <w:rPr>
           <w:b w:val="0"/>
         </w:rPr>
-        <w:t xml:space="preserve"> to build and document a multi-tenant private cloud for </w:t>
+        <w:t xml:space="preserve"> to design and document a hybrid multi-tenant environment for </w:t>
       </w:r>
       <w:r>
         <w:rPr>
           <w:b/>
         </w:rPr>
-        <w:t>2 simulated organizations</w:t>
+        <w:t>Company 1, Company 2, MSP operations, shared SAN storage, and cross-site protection</w:t>
       </w:r>
       <w:r>
         <w:rPr>
           <w:b w:val="0"/>
         </w:rPr>
-        <w:t xml:space="preserve"> on </w:t>
+        <w:t>.</w:t>
       </w:r>
+    </w:p>
+    <w:p>
+      <w:pPr>
+        <w:pStyle w:val="BulletStyle"/>
+        <w:spacing w:before="0" w:after="0" w:line="240" w:lineRule="auto"/>
+        <w:ind w:left="245" w:hanging="187"/>
+      </w:pPr>
       <w:r>
         <w:rPr>
           <w:b/>
         </w:rPr>
-        <w:t>2 HP DL380 servers</w:t>
+        <w:t xml:space="preserve">• </w:t>
       </w:r>
       <w:r>
         <w:rPr>
           <w:b w:val="0"/>
         </w:rPr>
-        <w:t xml:space="preserve">, segmenting </w:t>
+        <w:t xml:space="preserve">Segmented </w:t>
       </w:r>
       <w:r>
         <w:rPr>
@@ -177,7 +184,7 @@
         <w:rPr>
           <w:b w:val="0"/>
         </w:rPr>
-        <w:t xml:space="preserve"> and supporting </w:t>
+        <w:t xml:space="preserve"> and supported </w:t>
       </w:r>
       <w:r>
         <w:rPr>
@@ -189,7 +196,7 @@
         <w:rPr>
           <w:b w:val="0"/>
         </w:rPr>
-        <w:t xml:space="preserve"> across Proxmox VE, OPNsense, Windows Server 2022, and Samba AD.</w:t>
+        <w:t xml:space="preserve"> across Proxmox VE, OPNsense, Windows Server 2022, Samba AD, Veeam, Grafana, Windows Admin Center, and Cockpit.</w:t>
       </w:r>
     </w:p>
     <w:p>
@@ -214,13 +221,13 @@
         <w:rPr>
           <w:b/>
         </w:rPr>
-        <w:t>2 isolated identity and service stacks</w:t>
+        <w:t>tenant-separated identity, DNS, DHCP, DMZ web, file-service, and SAN/iSCSI workflows</w:t>
       </w:r>
       <w:r>
         <w:rPr>
           <w:b w:val="0"/>
         </w:rPr>
-        <w:t xml:space="preserve"> using AD DS, Samba AD, DNS, DHCP, GPO, SMB, and DMZ web services to maintain tenant separation and centralized administration on shared hardware.</w:t>
+        <w:t xml:space="preserve"> while preserving approved management paths and bounded security exposure.</w:t>
       </w:r>
     </w:p>
     <w:p>
@@ -257,102 +264,25 @@
         <w:rPr>
           <w:b/>
         </w:rPr>
-        <w:t>7 backup jobs offsite</w:t>
+        <w:t>7 selected backup jobs offsite</w:t>
       </w:r>
       <w:r>
         <w:rPr>
           <w:b w:val="0"/>
         </w:rPr>
-        <w:t xml:space="preserve"> by deploying Windows iSCSI storage, Veeam Backup &amp; Replication, and a site-to-site OpenVPN path; co-authored a </w:t>
+        <w:t xml:space="preserve"> over site-to-site OpenVPN; contributed to a </w:t>
       </w:r>
       <w:r>
         <w:rPr>
           <w:b/>
         </w:rPr>
-        <w:t>51-page</w:t>
+        <w:t>109-page integrated technical handover</w:t>
       </w:r>
       <w:r>
         <w:rPr>
           <w:b w:val="0"/>
         </w:rPr>
-        <w:t xml:space="preserve"> technical handover report for client IT/MSP transition.</w:t>
-      </w:r>
-    </w:p>
-    <w:p>
-      <w:pPr>
-        <w:pStyle w:val="BulletStyle"/>
-        <w:spacing w:before="0" w:after="0" w:line="240" w:lineRule="auto"/>
-        <w:ind w:left="245" w:hanging="187"/>
-      </w:pPr>
-      <w:r>
-        <w:rPr>
-          <w:b/>
-        </w:rPr>
-        <w:t xml:space="preserve">• </w:t>
-      </w:r>
-      <w:r>
-        <w:rPr>
-          <w:b w:val="0"/>
-        </w:rPr>
-        <w:t xml:space="preserve">Centralized monitoring and browser-based administration through </w:t>
-      </w:r>
-      <w:r>
-        <w:rPr>
-          <w:b/>
-        </w:rPr>
-        <w:t>Grafana, InfluxDB, Windows Admin Center, Cockpit, and dedicated jump hosts</w:t>
-      </w:r>
-      <w:r>
-        <w:rPr>
-          <w:b w:val="0"/>
-        </w:rPr>
-        <w:t>.</w:t>
-      </w:r>
-    </w:p>
-    <w:p>
-      <w:pPr>
-        <w:pStyle w:val="BodyStyle"/>
-        <w:spacing w:before="20" w:after="0" w:line="240" w:lineRule="auto"/>
-      </w:pPr>
-      <w:r>
-        <w:rPr>
-          <w:b/>
-        </w:rPr>
-        <w:t>Home Lab</w:t>
-      </w:r>
-      <w:r>
-        <w:t xml:space="preserve"> | Ongoing</w:t>
-      </w:r>
-    </w:p>
-    <w:p>
-      <w:pPr>
-        <w:pStyle w:val="BulletStyle"/>
-        <w:spacing w:before="0" w:after="0" w:line="240" w:lineRule="auto"/>
-        <w:ind w:left="245" w:hanging="187"/>
-      </w:pPr>
-      <w:r>
-        <w:rPr>
-          <w:b/>
-        </w:rPr>
-        <w:t xml:space="preserve">• </w:t>
-      </w:r>
-      <w:r>
-        <w:rPr>
-          <w:b w:val="0"/>
-        </w:rPr>
-        <w:t xml:space="preserve">Built a home lab using </w:t>
-      </w:r>
-      <w:r>
-        <w:rPr>
-          <w:b/>
-        </w:rPr>
-        <w:t>VLANs, OPNsense, OpenVPN, Docker, Ansible, and NAS-based backup workflows</w:t>
-      </w:r>
-      <w:r>
-        <w:rPr>
-          <w:b w:val="0"/>
-        </w:rPr>
-        <w:t xml:space="preserve"> to test segmentation, remote access, container deployment, and basic automation.</w:t>
+        <w:t xml:space="preserve"> for client IT/MSP support transition.</w:t>
       </w:r>
     </w:p>
     <w:p>
@@ -377,59 +307,13 @@
         <w:rPr>
           <w:b/>
         </w:rPr>
-        <w:t>portfolio site and GitHub showcase</w:t>
+        <w:t>sanitized portfolio and GitHub project</w:t>
       </w:r>
       <w:r>
         <w:rPr>
           <w:b w:val="0"/>
         </w:rPr>
-        <w:t xml:space="preserve"> to present sanitized home lab architecture, project metrics, and technical documentation for recruiters and hiring teams.</w:t>
-      </w:r>
-    </w:p>
-    <w:p>
-      <w:pPr>
-        <w:pStyle w:val="BodyStyle"/>
-        <w:spacing w:before="20" w:after="0" w:line="240" w:lineRule="auto"/>
-      </w:pPr>
-      <w:r>
-        <w:rPr>
-          <w:b/>
-        </w:rPr>
-        <w:t>Wireless Network Lab</w:t>
-      </w:r>
-      <w:r>
-        <w:t xml:space="preserve"> | Fall 2025 - Winter 2026</w:t>
-      </w:r>
-    </w:p>
-    <w:p>
-      <w:pPr>
-        <w:pStyle w:val="BulletStyle"/>
-        <w:spacing w:before="0" w:after="0" w:line="240" w:lineRule="auto"/>
-        <w:ind w:left="245" w:hanging="187"/>
-      </w:pPr>
-      <w:r>
-        <w:rPr>
-          <w:b/>
-        </w:rPr>
-        <w:t xml:space="preserve">• </w:t>
-      </w:r>
-      <w:r>
-        <w:rPr>
-          <w:b w:val="0"/>
-        </w:rPr>
-        <w:t xml:space="preserve">Configured </w:t>
-      </w:r>
-      <w:r>
-        <w:rPr>
-          <w:b/>
-        </w:rPr>
-        <w:t>Aruba wireless controllers with PEAP and MAC authentication</w:t>
-      </w:r>
-      <w:r>
-        <w:rPr>
-          <w:b w:val="0"/>
-        </w:rPr>
-        <w:t xml:space="preserve"> to secure client access in a simulated enterprise WLAN environment.</w:t>
+        <w:t xml:space="preserve"> to present capstone architecture, validation logic, failure-domain thinking, and support documentation for recruiters and hiring teams.</w:t>
       </w:r>
     </w:p>
     <w:p>
@@ -453,7 +337,7 @@
         <w:t xml:space="preserve">Infrastructure: </w:t>
       </w:r>
       <w:r>
-        <w:t>Proxmox VE, Hyper-V, Windows Server 2019/2022, Ubuntu, Red Hat/CentOS, Alpine Linux, Windows 10/11</w:t>
+        <w:t>Proxmox VE, Windows Server 2022, Ubuntu, Red Hat/CentOS, Alpine Linux, Windows 10/11</w:t>
       </w:r>
     </w:p>
     <w:p>
@@ -468,7 +352,7 @@
         <w:t xml:space="preserve">Networking: </w:t>
       </w:r>
       <w:r>
-        <w:t>Cisco IOS, ArubaOS, VLANs, OSPF, STP, TCP/IP, DNS, DHCP, VPN, OPNsense/pfSense, NAT, DMZ</w:t>
+        <w:t>OPNsense/pfSense, Cisco IOS, ArubaOS, VLANs, OSPF, STP, TCP/IP, DNS, DHCP, VPN, NAT, DMZ</w:t>
       </w:r>
     </w:p>
     <w:p>
@@ -483,7 +367,7 @@
         <w:t xml:space="preserve">Administration &amp; Tools: </w:t>
       </w:r>
       <w:r>
-        <w:t>AD DS, GPO, Samba AD, iSCSI, Veeam Backup &amp; Replication, Grafana, InfluxDB, Windows Admin Center, Cockpit, Docker, Ansible, Wireshark, Microsoft 365</w:t>
+        <w:t>AD DS, GPO, Samba AD, iSCSI, Veeam Backup &amp; Replication, Grafana, InfluxDB, Windows Admin Center, Cockpit, Wireshark, Microsoft 365</w:t>
       </w:r>
     </w:p>
     <w:p>

</xml_diff>

<commit_message>
Clarify Site 1 and Site 2 scope on portfolio
</commit_message>
<xml_diff>
--- a/assets/Yiqin_Huang_Resume_One_Page.docx
+++ b/assets/Yiqin_Huang_Resume_One_Page.docx
@@ -141,19 +141,19 @@
         <w:rPr>
           <w:b w:val="0"/>
         </w:rPr>
-        <w:t xml:space="preserve"> to design and document a hybrid multi-tenant environment for </w:t>
+        <w:t xml:space="preserve"> to deliver an integrated </w:t>
       </w:r>
       <w:r>
         <w:rPr>
           <w:b/>
         </w:rPr>
-        <w:t>Company 1, Company 2, MSP operations, shared SAN storage, and cross-site protection</w:t>
+        <w:t>Site 1 + Site 2</w:t>
       </w:r>
       <w:r>
         <w:rPr>
           <w:b w:val="0"/>
         </w:rPr>
-        <w:t>.</w:t>
+        <w:t xml:space="preserve"> capstone covering Company 1, Company 2, MSP operations, shared SAN storage, and cross-site protection.</w:t>
       </w:r>
     </w:p>
     <w:p>
@@ -172,7 +172,19 @@
         <w:rPr>
           <w:b w:val="0"/>
         </w:rPr>
-        <w:t xml:space="preserve">Segmented </w:t>
+        <w:t xml:space="preserve">Primary hands-on contribution focused on </w:t>
+      </w:r>
+      <w:r>
+        <w:rPr>
+          <w:b/>
+        </w:rPr>
+        <w:t>Site 1</w:t>
+      </w:r>
+      <w:r>
+        <w:rPr>
+          <w:b w:val="0"/>
+        </w:rPr>
+        <w:t xml:space="preserve">: segmented </w:t>
       </w:r>
       <w:r>
         <w:rPr>
@@ -190,7 +202,7 @@
         <w:rPr>
           <w:b/>
         </w:rPr>
-        <w:t>12 workloads</w:t>
+        <w:t>12 documented workloads</w:t>
       </w:r>
       <w:r>
         <w:rPr>
@@ -221,7 +233,7 @@
         <w:rPr>
           <w:b/>
         </w:rPr>
-        <w:t>tenant-separated identity, DNS, DHCP, DMZ web, file-service, and SAN/iSCSI workflows</w:t>
+        <w:t>Site 1 tenant-separated identity, DNS, DHCP, DMZ web, file-service, and SAN/iSCSI workflows</w:t>
       </w:r>
       <w:r>
         <w:rPr>
@@ -252,7 +264,7 @@
         <w:rPr>
           <w:b/>
         </w:rPr>
-        <w:t>10 local systems</w:t>
+        <w:t>10 Site 1 systems</w:t>
       </w:r>
       <w:r>
         <w:rPr>
@@ -270,7 +282,19 @@
         <w:rPr>
           <w:b w:val="0"/>
         </w:rPr>
-        <w:t xml:space="preserve"> over site-to-site OpenVPN; contributed to a </w:t>
+        <w:t xml:space="preserve"> over site-to-site OpenVPN; incorporated the broader </w:t>
+      </w:r>
+      <w:r>
+        <w:rPr>
+          <w:b/>
+        </w:rPr>
+        <w:t>Site 2 MSP access and recovery context</w:t>
+      </w:r>
+      <w:r>
+        <w:rPr>
+          <w:b w:val="0"/>
+        </w:rPr>
+        <w:t xml:space="preserve"> into a </w:t>
       </w:r>
       <w:r>
         <w:rPr>
@@ -282,7 +306,7 @@
         <w:rPr>
           <w:b w:val="0"/>
         </w:rPr>
-        <w:t xml:space="preserve"> for client IT/MSP support transition.</w:t>
+        <w:t>.</w:t>
       </w:r>
     </w:p>
     <w:p>
@@ -313,7 +337,7 @@
         <w:rPr>
           <w:b w:val="0"/>
         </w:rPr>
-        <w:t xml:space="preserve"> to present capstone architecture, validation logic, failure-domain thinking, and support documentation for recruiters and hiring teams.</w:t>
+        <w:t xml:space="preserve"> to explain Site 1 delivery, Site 2 integration context, validation logic, failure-domain thinking, and support documentation for recruiters and hiring teams.</w:t>
       </w:r>
     </w:p>
     <w:p>

</xml_diff>

<commit_message>
Refresh downloadable resume formatting and content
</commit_message>
<xml_diff>
--- a/assets/Yiqin_Huang_Resume_One_Page.docx
+++ b/assets/Yiqin_Huang_Resume_One_Page.docx
@@ -47,13 +47,31 @@
         <w:spacing w:before="80" w:after="20" w:line="240" w:lineRule="auto"/>
       </w:pPr>
       <w:r>
+        <w:t>SUMMARY</w:t>
+      </w:r>
+    </w:p>
+    <w:p>
+      <w:pPr>
+        <w:pStyle w:val="SummaryStyle"/>
+        <w:spacing w:before="0" w:after="20" w:line="252" w:lineRule="auto"/>
+      </w:pPr>
+      <w:r>
+        <w:t>Dean's Honour List networking student (GPA 3.99/4.0) with hands-on Site 1 implementation experience in an integrated enterprise infrastructure capstone spanning multi-tenant services, storage, monitoring, backup, and cross-site protection. Brings 13+ years of prior operations and supply-chain experience, adding mature documentation, coordination, and problem-solving skills to junior systems and network support work.</w:t>
+      </w:r>
+    </w:p>
+    <w:p>
+      <w:pPr>
+        <w:pStyle w:val="SectionStyle"/>
+        <w:spacing w:before="80" w:after="20" w:line="240" w:lineRule="auto"/>
+      </w:pPr>
+      <w:r>
         <w:t>EDUCATION</w:t>
       </w:r>
     </w:p>
     <w:p>
       <w:pPr>
         <w:pStyle w:val="BodyStyle"/>
-        <w:spacing w:before="20" w:after="0" w:line="240" w:lineRule="auto"/>
+        <w:spacing w:before="20" w:after="0" w:line="245" w:lineRule="auto"/>
       </w:pPr>
       <w:r>
         <w:rPr>
@@ -68,7 +86,7 @@
     <w:p>
       <w:pPr>
         <w:pStyle w:val="BodyStyle"/>
-        <w:spacing w:before="0" w:after="0" w:line="240" w:lineRule="auto"/>
+        <w:spacing w:before="0" w:after="0" w:line="245" w:lineRule="auto"/>
       </w:pPr>
       <w:r>
         <w:t>GPA: 3.99/4.0 | Dean's Honour List (Fall 2024, Winter 2025, Summer 2025)</w:t>
@@ -77,7 +95,7 @@
     <w:p>
       <w:pPr>
         <w:pStyle w:val="BodyStyle"/>
-        <w:spacing w:before="20" w:after="0" w:line="240" w:lineRule="auto"/>
+        <w:spacing w:before="20" w:after="0" w:line="245" w:lineRule="auto"/>
       </w:pPr>
       <w:r>
         <w:rPr>
@@ -101,7 +119,7 @@
     <w:p>
       <w:pPr>
         <w:pStyle w:val="BodyStyle"/>
-        <w:spacing w:before="20" w:after="0" w:line="240" w:lineRule="auto"/>
+        <w:spacing w:before="20" w:after="0" w:line="245" w:lineRule="auto"/>
       </w:pPr>
       <w:r>
         <w:rPr>
@@ -116,7 +134,7 @@
     <w:p>
       <w:pPr>
         <w:pStyle w:val="BulletStyle"/>
-        <w:spacing w:before="0" w:after="0" w:line="240" w:lineRule="auto"/>
+        <w:spacing w:before="0" w:after="0" w:line="247" w:lineRule="auto"/>
         <w:ind w:left="245" w:hanging="187"/>
       </w:pPr>
       <w:r>
@@ -159,7 +177,7 @@
     <w:p>
       <w:pPr>
         <w:pStyle w:val="BulletStyle"/>
-        <w:spacing w:before="0" w:after="0" w:line="240" w:lineRule="auto"/>
+        <w:spacing w:before="0" w:after="0" w:line="247" w:lineRule="auto"/>
         <w:ind w:left="245" w:hanging="187"/>
       </w:pPr>
       <w:r>
@@ -184,7 +202,38 @@
         <w:rPr>
           <w:b w:val="0"/>
         </w:rPr>
-        <w:t xml:space="preserve">: segmented </w:t>
+        <w:t xml:space="preserve"> on </w:t>
+      </w:r>
+      <w:r>
+        <w:rPr>
+          <w:b/>
+        </w:rPr>
+        <w:t>2 HP DL380 servers</w:t>
+      </w:r>
+      <w:r>
+        <w:rPr>
+          <w:b w:val="0"/>
+        </w:rPr>
+        <w:t>, with Site 2 retained as integrated context for MSP access, offsite protection, and recovery workflows.</w:t>
+      </w:r>
+    </w:p>
+    <w:p>
+      <w:pPr>
+        <w:pStyle w:val="BulletStyle"/>
+        <w:spacing w:before="0" w:after="0" w:line="247" w:lineRule="auto"/>
+        <w:ind w:left="245" w:hanging="187"/>
+      </w:pPr>
+      <w:r>
+        <w:rPr>
+          <w:b/>
+        </w:rPr>
+        <w:t xml:space="preserve">• </w:t>
+      </w:r>
+      <w:r>
+        <w:rPr>
+          <w:b w:val="0"/>
+        </w:rPr>
+        <w:t xml:space="preserve">Segmented </w:t>
       </w:r>
       <w:r>
         <w:rPr>
@@ -214,7 +263,7 @@
     <w:p>
       <w:pPr>
         <w:pStyle w:val="BulletStyle"/>
-        <w:spacing w:before="0" w:after="0" w:line="240" w:lineRule="auto"/>
+        <w:spacing w:before="0" w:after="0" w:line="247" w:lineRule="auto"/>
         <w:ind w:left="245" w:hanging="187"/>
       </w:pPr>
       <w:r>
@@ -245,7 +294,7 @@
     <w:p>
       <w:pPr>
         <w:pStyle w:val="BulletStyle"/>
-        <w:spacing w:before="0" w:after="0" w:line="240" w:lineRule="auto"/>
+        <w:spacing w:before="0" w:after="0" w:line="247" w:lineRule="auto"/>
         <w:ind w:left="245" w:hanging="187"/>
       </w:pPr>
       <w:r>
@@ -312,7 +361,7 @@
     <w:p>
       <w:pPr>
         <w:pStyle w:val="BulletStyle"/>
-        <w:spacing w:before="0" w:after="0" w:line="240" w:lineRule="auto"/>
+        <w:spacing w:before="0" w:after="0" w:line="247" w:lineRule="auto"/>
         <w:ind w:left="245" w:hanging="187"/>
       </w:pPr>
       <w:r>
@@ -352,7 +401,7 @@
     <w:p>
       <w:pPr>
         <w:pStyle w:val="BodyStyle"/>
-        <w:spacing w:before="20" w:after="0" w:line="240" w:lineRule="auto"/>
+        <w:spacing w:before="20" w:after="0" w:line="245" w:lineRule="auto"/>
       </w:pPr>
       <w:r>
         <w:rPr>
@@ -367,7 +416,7 @@
     <w:p>
       <w:pPr>
         <w:pStyle w:val="BodyStyle"/>
-        <w:spacing w:before="0" w:after="0" w:line="240" w:lineRule="auto"/>
+        <w:spacing w:before="0" w:after="0" w:line="245" w:lineRule="auto"/>
       </w:pPr>
       <w:r>
         <w:rPr>
@@ -382,7 +431,7 @@
     <w:p>
       <w:pPr>
         <w:pStyle w:val="BodyStyle"/>
-        <w:spacing w:before="0" w:after="0" w:line="240" w:lineRule="auto"/>
+        <w:spacing w:before="0" w:after="0" w:line="245" w:lineRule="auto"/>
       </w:pPr>
       <w:r>
         <w:rPr>
@@ -406,7 +455,7 @@
     <w:p>
       <w:pPr>
         <w:pStyle w:val="BodyStyle"/>
-        <w:spacing w:before="20" w:after="0" w:line="240" w:lineRule="auto"/>
+        <w:spacing w:before="20" w:after="0" w:line="245" w:lineRule="auto"/>
       </w:pPr>
       <w:r>
         <w:rPr>
@@ -415,13 +464,13 @@
         <w:t>Senior Business Representative, Winbond Integrated Circuit (Suzhou) Co., Ltd</w:t>
       </w:r>
       <w:r>
-        <w:t xml:space="preserve"> | Oct 2018 - Sep 2022</w:t>
+        <w:t xml:space="preserve"> | 2018-2022</w:t>
       </w:r>
     </w:p>
     <w:p>
       <w:pPr>
         <w:pStyle w:val="BulletStyle"/>
-        <w:spacing w:before="0" w:after="0" w:line="240" w:lineRule="auto"/>
+        <w:spacing w:before="0" w:after="0" w:line="247" w:lineRule="auto"/>
         <w:ind w:left="245" w:hanging="187"/>
       </w:pPr>
       <w:r>
@@ -451,8 +500,39 @@
     </w:p>
     <w:p>
       <w:pPr>
+        <w:pStyle w:val="BulletStyle"/>
+        <w:spacing w:before="0" w:after="0" w:line="247" w:lineRule="auto"/>
+        <w:ind w:left="245" w:hanging="187"/>
+      </w:pPr>
+      <w:r>
+        <w:rPr>
+          <w:b/>
+        </w:rPr>
+        <w:t xml:space="preserve">• </w:t>
+      </w:r>
+      <w:r>
+        <w:rPr>
+          <w:b w:val="0"/>
+        </w:rPr>
+        <w:t xml:space="preserve">Identified </w:t>
+      </w:r>
+      <w:r>
+        <w:rPr>
+          <w:b/>
+        </w:rPr>
+        <w:t>new opportunities in IoT, wearables, and networking markets</w:t>
+      </w:r>
+      <w:r>
+        <w:rPr>
+          <w:b w:val="0"/>
+        </w:rPr>
+        <w:t xml:space="preserve"> and coordinated cross-functional teams to align roadmap, demand, and customer requirements.</w:t>
+      </w:r>
+    </w:p>
+    <w:p>
+      <w:pPr>
         <w:pStyle w:val="BodyStyle"/>
-        <w:spacing w:before="20" w:after="0" w:line="240" w:lineRule="auto"/>
+        <w:spacing w:before="20" w:after="0" w:line="245" w:lineRule="auto"/>
       </w:pPr>
       <w:r>
         <w:rPr>
@@ -461,13 +541,13 @@
         <w:t>Resource Development Manager, Shanghai Uniscope Electronics Co., Ltd</w:t>
       </w:r>
       <w:r>
-        <w:t xml:space="preserve"> | Mar 2009 - Sep 2018</w:t>
+        <w:t xml:space="preserve"> | 2009-2018</w:t>
       </w:r>
     </w:p>
     <w:p>
       <w:pPr>
         <w:pStyle w:val="BulletStyle"/>
-        <w:spacing w:before="0" w:after="0" w:line="240" w:lineRule="auto"/>
+        <w:spacing w:before="0" w:after="0" w:line="247" w:lineRule="auto"/>
         <w:ind w:left="245" w:hanging="187"/>
       </w:pPr>
       <w:r>
@@ -517,6 +597,49 @@
           <w:b w:val="0"/>
         </w:rPr>
         <w:t xml:space="preserve"> by improving supplier management, shortage response, and purchasing workflows.</w:t>
+      </w:r>
+    </w:p>
+    <w:p>
+      <w:pPr>
+        <w:pStyle w:val="BulletStyle"/>
+        <w:spacing w:before="0" w:after="0" w:line="247" w:lineRule="auto"/>
+        <w:ind w:left="245" w:hanging="187"/>
+      </w:pPr>
+      <w:r>
+        <w:rPr>
+          <w:b/>
+        </w:rPr>
+        <w:t xml:space="preserve">• </w:t>
+      </w:r>
+      <w:r>
+        <w:rPr>
+          <w:b w:val="0"/>
+        </w:rPr>
+        <w:t xml:space="preserve">Reduced </w:t>
+      </w:r>
+      <w:r>
+        <w:rPr>
+          <w:b/>
+        </w:rPr>
+        <w:t>supply-chain disruptions by 8%</w:t>
+      </w:r>
+      <w:r>
+        <w:rPr>
+          <w:b w:val="0"/>
+        </w:rPr>
+        <w:t xml:space="preserve"> and improved </w:t>
+      </w:r>
+      <w:r>
+        <w:rPr>
+          <w:b/>
+        </w:rPr>
+        <w:t>supplier performance by 10%</w:t>
+      </w:r>
+      <w:r>
+        <w:rPr>
+          <w:b w:val="0"/>
+        </w:rPr>
+        <w:t xml:space="preserve"> through stronger vendor management, inventory control, and escalation handling.</w:t>
       </w:r>
     </w:p>
     <w:sectPr>
@@ -893,7 +1016,7 @@
     <w:qFormat/>
     <w:rsid w:val="00FC693F"/>
     <w:rPr>
-      <w:rFonts w:ascii="Calibri" w:hAnsi="Calibri" w:eastAsia="Calibri"/>
+      <w:rFonts w:ascii="Aptos" w:hAnsi="Aptos" w:eastAsia="Aptos"/>
       <w:sz w:val="20"/>
     </w:rPr>
   </w:style>
@@ -12582,17 +12705,17 @@
   <w:style w:type="paragraph" w:customStyle="1" w:styleId="NameStyle">
     <w:name w:val="NameStyle"/>
     <w:rPr>
-      <w:rFonts w:ascii="Calibri" w:hAnsi="Calibri" w:eastAsia="Calibri"/>
+      <w:rFonts w:ascii="Aptos" w:hAnsi="Aptos" w:eastAsia="Aptos"/>
       <w:b/>
       <w:i w:val="0"/>
       <w:color w:val="1A73E8"/>
-      <w:sz w:val="35"/>
+      <w:sz w:val="36"/>
     </w:rPr>
   </w:style>
   <w:style w:type="paragraph" w:customStyle="1" w:styleId="ContactStyle">
     <w:name w:val="ContactStyle"/>
     <w:rPr>
-      <w:rFonts w:ascii="Calibri" w:hAnsi="Calibri" w:eastAsia="Calibri"/>
+      <w:rFonts w:ascii="Aptos" w:hAnsi="Aptos" w:eastAsia="Aptos"/>
       <w:b w:val="0"/>
       <w:i w:val="0"/>
       <w:color w:val="5F6368"/>
@@ -12602,17 +12725,17 @@
   <w:style w:type="paragraph" w:customStyle="1" w:styleId="TagStyle">
     <w:name w:val="TagStyle"/>
     <w:rPr>
-      <w:rFonts w:ascii="Calibri" w:hAnsi="Calibri" w:eastAsia="Calibri"/>
+      <w:rFonts w:ascii="Aptos" w:hAnsi="Aptos" w:eastAsia="Aptos"/>
       <w:b w:val="0"/>
       <w:i/>
-      <w:color w:val="000000"/>
-      <w:sz w:val="19"/>
+      <w:color w:val="1F1F1F"/>
+      <w:sz w:val="20"/>
     </w:rPr>
   </w:style>
   <w:style w:type="paragraph" w:customStyle="1" w:styleId="SectionStyle">
     <w:name w:val="SectionStyle"/>
     <w:rPr>
-      <w:rFonts w:ascii="Calibri" w:hAnsi="Calibri" w:eastAsia="Calibri"/>
+      <w:rFonts w:ascii="Aptos" w:hAnsi="Aptos" w:eastAsia="Aptos"/>
       <w:b/>
       <w:i w:val="0"/>
       <w:color w:val="1A73E8"/>
@@ -12622,21 +12745,31 @@
   <w:style w:type="paragraph" w:customStyle="1" w:styleId="BodyStyle">
     <w:name w:val="BodyStyle"/>
     <w:rPr>
-      <w:rFonts w:ascii="Calibri" w:hAnsi="Calibri" w:eastAsia="Calibri"/>
+      <w:rFonts w:ascii="Aptos" w:hAnsi="Aptos" w:eastAsia="Aptos"/>
       <w:b w:val="0"/>
       <w:i w:val="0"/>
-      <w:color w:val="000000"/>
+      <w:color w:val="1F1F1F"/>
       <w:sz w:val="20"/>
     </w:rPr>
   </w:style>
   <w:style w:type="paragraph" w:customStyle="1" w:styleId="BulletStyle">
     <w:name w:val="BulletStyle"/>
     <w:rPr>
-      <w:rFonts w:ascii="Calibri" w:hAnsi="Calibri" w:eastAsia="Calibri"/>
+      <w:rFonts w:ascii="Aptos" w:hAnsi="Aptos" w:eastAsia="Aptos"/>
       <w:b w:val="0"/>
       <w:i w:val="0"/>
-      <w:color w:val="000000"/>
+      <w:color w:val="1F1F1F"/>
       <w:sz w:val="19"/>
+    </w:rPr>
+  </w:style>
+  <w:style w:type="paragraph" w:customStyle="1" w:styleId="SummaryStyle">
+    <w:name w:val="SummaryStyle"/>
+    <w:rPr>
+      <w:rFonts w:ascii="Aptos" w:hAnsi="Aptos" w:eastAsia="Aptos"/>
+      <w:b w:val="0"/>
+      <w:i w:val="0"/>
+      <w:color w:val="1F1F1F"/>
+      <w:sz w:val="20"/>
     </w:rPr>
   </w:style>
 </w:styles>

</xml_diff>

<commit_message>
Clarify capstone cloud roles on portfolio
</commit_message>
<xml_diff>
--- a/assets/Yiqin_Huang_Resume_One_Page.docx
+++ b/assets/Yiqin_Huang_Resume_One_Page.docx
@@ -4,647 +4,555 @@
   <w:body>
     <w:p>
       <w:pPr>
-        <w:pStyle w:val="NameStyle"/>
-        <w:spacing w:before="0" w:after="0" w:line="240" w:lineRule="auto"/>
+        <w:spacing w:before="0" w:after="30" w:line="240" w:lineRule="auto"/>
+        <w:jc w:val="center"/>
       </w:pPr>
       <w:r>
+        <w:rPr>
+          <w:rFonts w:ascii="Aptos Display" w:hAnsi="Aptos Display" w:eastAsia="Aptos Display"/>
+          <w:b/>
+          <w:color w:val="4285F4"/>
+          <w:sz w:val="35"/>
+        </w:rPr>
         <w:t>Yiqin Huang</w:t>
       </w:r>
     </w:p>
     <w:p>
       <w:pPr>
-        <w:pStyle w:val="ContactStyle"/>
-        <w:spacing w:before="0" w:after="0" w:line="240" w:lineRule="auto"/>
+        <w:spacing w:before="0" w:after="12" w:line="240" w:lineRule="auto"/>
+        <w:jc w:val="center"/>
       </w:pPr>
       <w:r>
+        <w:rPr>
+          <w:rFonts w:ascii="Aptos" w:hAnsi="Aptos" w:eastAsia="Aptos"/>
+          <w:color w:val="222222"/>
+          <w:sz w:val="17"/>
+        </w:rPr>
         <w:t>Ottawa, ON | 613-608-9256 | huangstephen3@gmail.com</w:t>
       </w:r>
     </w:p>
     <w:p>
       <w:pPr>
-        <w:pStyle w:val="ContactStyle"/>
-        <w:spacing w:before="0" w:after="40" w:line="240" w:lineRule="auto"/>
+        <w:spacing w:before="0" w:after="12" w:line="240" w:lineRule="auto"/>
+        <w:jc w:val="center"/>
       </w:pPr>
       <w:r>
+        <w:rPr>
+          <w:rFonts w:ascii="Aptos" w:hAnsi="Aptos" w:eastAsia="Aptos"/>
+          <w:color w:val="222222"/>
+          <w:sz w:val="17"/>
+        </w:rPr>
         <w:t>LinkedIn: linkedin.com/in/yiqinhuang2025 | Portfolio: https://huangstephen3.github.io</w:t>
       </w:r>
     </w:p>
     <w:p>
       <w:pPr>
-        <w:pStyle w:val="TagStyle"/>
-        <w:spacing w:before="0" w:after="80" w:line="240" w:lineRule="auto"/>
-        <w:pBdr>
-          <w:bottom w:val="single" w:sz="6" w:space="1" w:color="1A73E8"/>
-        </w:pBdr>
+        <w:spacing w:before="0" w:after="26" w:line="240" w:lineRule="auto"/>
+        <w:jc w:val="center"/>
       </w:pPr>
       <w:r>
+        <w:rPr>
+          <w:rFonts w:ascii="Aptos" w:hAnsi="Aptos" w:eastAsia="Aptos"/>
+          <w:b/>
+          <w:color w:val="222222"/>
+          <w:sz w:val="17"/>
+        </w:rPr>
         <w:t>Computer Systems Technician - Networking Student | Seeking Junior Systems / Network Support Roles</w:t>
       </w:r>
     </w:p>
     <w:p>
       <w:pPr>
-        <w:pStyle w:val="SectionStyle"/>
-        <w:spacing w:before="80" w:after="20" w:line="240" w:lineRule="auto"/>
+        <w:spacing w:before="60" w:after="30" w:line="240" w:lineRule="auto"/>
       </w:pPr>
       <w:r>
+        <w:rPr>
+          <w:rFonts w:ascii="Aptos" w:hAnsi="Aptos" w:eastAsia="Aptos"/>
+          <w:b/>
+          <w:color w:val="4285F4"/>
+          <w:sz w:val="19"/>
+        </w:rPr>
         <w:t>SUMMARY</w:t>
       </w:r>
     </w:p>
     <w:p>
       <w:pPr>
-        <w:pStyle w:val="SummaryStyle"/>
-        <w:spacing w:before="0" w:after="20" w:line="252" w:lineRule="auto"/>
+        <w:spacing w:before="0" w:after="28" w:line="240" w:lineRule="auto"/>
       </w:pPr>
       <w:r>
-        <w:t>Dean's Honour List networking student (GPA 3.99/4.0) with hands-on Site 1 implementation experience in an integrated enterprise infrastructure capstone spanning multi-tenant services, storage, monitoring, backup, and cross-site protection. Brings 13+ years of prior operations and supply-chain experience, adding mature documentation, coordination, and problem-solving skills to junior systems and network support work.</w:t>
+        <w:rPr>
+          <w:rFonts w:ascii="Aptos" w:hAnsi="Aptos" w:eastAsia="Aptos"/>
+          <w:b w:val="0"/>
+          <w:color w:val="222222"/>
+          <w:sz w:val="18"/>
+        </w:rPr>
+        <w:t>Dean's Honour List networking student (GPA 3.99/4.0) with hands-on implementation experience in an integrated enterprise infrastructure capstone spanning a simulated private-cloud primary environment and simulated public-cloud secondary environment across multi-tenant services, storage, monitoring, backup, and cross-site protection. Brings 13+ years of prior operations and supply-chain experience, adding mature documentation, coordination, and problem-solving skills to junior systems and network support work.</w:t>
       </w:r>
     </w:p>
     <w:p>
       <w:pPr>
-        <w:pStyle w:val="SectionStyle"/>
-        <w:spacing w:before="80" w:after="20" w:line="240" w:lineRule="auto"/>
+        <w:spacing w:before="60" w:after="30" w:line="240" w:lineRule="auto"/>
       </w:pPr>
       <w:r>
+        <w:rPr>
+          <w:rFonts w:ascii="Aptos" w:hAnsi="Aptos" w:eastAsia="Aptos"/>
+          <w:b/>
+          <w:color w:val="4285F4"/>
+          <w:sz w:val="19"/>
+        </w:rPr>
         <w:t>EDUCATION</w:t>
       </w:r>
     </w:p>
     <w:p>
       <w:pPr>
-        <w:pStyle w:val="BodyStyle"/>
-        <w:spacing w:before="20" w:after="0" w:line="245" w:lineRule="auto"/>
+        <w:spacing w:before="0" w:after="6" w:line="240" w:lineRule="auto"/>
       </w:pPr>
       <w:r>
         <w:rPr>
+          <w:rFonts w:ascii="Aptos" w:hAnsi="Aptos" w:eastAsia="Aptos"/>
           <w:b/>
+          <w:color w:val="222222"/>
+          <w:sz w:val="18"/>
         </w:rPr>
-        <w:t>Algonquin College, Ottawa, ON</w:t>
+        <w:t>Algonquin College</w:t>
       </w:r>
       <w:r>
-        <w:t xml:space="preserve"> | Computer Systems Technician - Networking Diploma, Expected Graduation: April 2026</w:t>
+        <w:rPr>
+          <w:rFonts w:ascii="Aptos" w:hAnsi="Aptos" w:eastAsia="Aptos"/>
+          <w:b w:val="0"/>
+          <w:color w:val="222222"/>
+          <w:sz w:val="18"/>
+        </w:rPr>
+        <w:t>, Ottawa, ON</w:t>
       </w:r>
     </w:p>
     <w:p>
       <w:pPr>
-        <w:pStyle w:val="BodyStyle"/>
-        <w:spacing w:before="0" w:after="0" w:line="245" w:lineRule="auto"/>
+        <w:spacing w:before="0" w:after="4" w:line="240" w:lineRule="auto"/>
       </w:pPr>
       <w:r>
+        <w:rPr>
+          <w:rFonts w:ascii="Aptos" w:hAnsi="Aptos" w:eastAsia="Aptos"/>
+          <w:b w:val="0"/>
+          <w:color w:val="222222"/>
+          <w:sz w:val="18"/>
+        </w:rPr>
+        <w:t>Computer Systems Technician - Networking Diploma, Expected Graduation: April 2026</w:t>
+      </w:r>
+    </w:p>
+    <w:p>
+      <w:pPr>
+        <w:spacing w:before="0" w:after="4" w:line="240" w:lineRule="auto"/>
+      </w:pPr>
+      <w:r>
+        <w:rPr>
+          <w:rFonts w:ascii="Aptos" w:hAnsi="Aptos" w:eastAsia="Aptos"/>
+          <w:b w:val="0"/>
+          <w:color w:val="222222"/>
+          <w:sz w:val="18"/>
+        </w:rPr>
         <w:t>GPA: 3.99/4.0 | Dean's Honour List (Fall 2024, Winter 2025, Summer 2025)</w:t>
       </w:r>
     </w:p>
     <w:p>
       <w:pPr>
-        <w:pStyle w:val="BodyStyle"/>
-        <w:spacing w:before="20" w:after="0" w:line="245" w:lineRule="auto"/>
+        <w:spacing w:before="0" w:after="4" w:line="240" w:lineRule="auto"/>
+      </w:pPr>
+    </w:p>
+    <w:p>
+      <w:pPr>
+        <w:spacing w:before="0" w:after="6" w:line="240" w:lineRule="auto"/>
       </w:pPr>
       <w:r>
         <w:rPr>
+          <w:rFonts w:ascii="Aptos" w:hAnsi="Aptos" w:eastAsia="Aptos"/>
           <w:b/>
+          <w:color w:val="222222"/>
+          <w:sz w:val="18"/>
         </w:rPr>
-        <w:t>Shanghai Normal University, Shanghai, China</w:t>
+        <w:t>Shanghai Normal University</w:t>
       </w:r>
       <w:r>
-        <w:t xml:space="preserve"> | Bachelor of Communication Engineering</w:t>
+        <w:rPr>
+          <w:rFonts w:ascii="Aptos" w:hAnsi="Aptos" w:eastAsia="Aptos"/>
+          <w:b w:val="0"/>
+          <w:color w:val="222222"/>
+          <w:sz w:val="18"/>
+        </w:rPr>
+        <w:t>, Shanghai, China</w:t>
       </w:r>
     </w:p>
     <w:p>
       <w:pPr>
-        <w:pStyle w:val="SectionStyle"/>
-        <w:spacing w:before="80" w:after="20" w:line="240" w:lineRule="auto"/>
+        <w:spacing w:before="0" w:after="4" w:line="240" w:lineRule="auto"/>
       </w:pPr>
       <w:r>
+        <w:rPr>
+          <w:rFonts w:ascii="Aptos" w:hAnsi="Aptos" w:eastAsia="Aptos"/>
+          <w:b w:val="0"/>
+          <w:color w:val="222222"/>
+          <w:sz w:val="18"/>
+        </w:rPr>
+        <w:t>Bachelor of Communication Engineering</w:t>
+      </w:r>
+    </w:p>
+    <w:p>
+      <w:pPr>
+        <w:spacing w:before="0" w:after="4" w:line="240" w:lineRule="auto"/>
+      </w:pPr>
+    </w:p>
+    <w:p>
+      <w:pPr>
+        <w:spacing w:before="60" w:after="30" w:line="240" w:lineRule="auto"/>
+      </w:pPr>
+      <w:r>
+        <w:rPr>
+          <w:rFonts w:ascii="Aptos" w:hAnsi="Aptos" w:eastAsia="Aptos"/>
+          <w:b/>
+          <w:color w:val="4285F4"/>
+          <w:sz w:val="19"/>
+        </w:rPr>
         <w:t>TECHNICAL PROJECTS</w:t>
       </w:r>
     </w:p>
     <w:p>
       <w:pPr>
-        <w:pStyle w:val="BodyStyle"/>
-        <w:spacing w:before="20" w:after="0" w:line="245" w:lineRule="auto"/>
+        <w:spacing w:before="0" w:after="6" w:line="240" w:lineRule="auto"/>
       </w:pPr>
       <w:r>
         <w:rPr>
+          <w:rFonts w:ascii="Aptos" w:hAnsi="Aptos" w:eastAsia="Aptos"/>
           <w:b/>
+          <w:color w:val="222222"/>
+          <w:sz w:val="18"/>
         </w:rPr>
         <w:t>Enterprise Infrastructure Capstone</w:t>
       </w:r>
       <w:r>
+        <w:rPr>
+          <w:rFonts w:ascii="Aptos" w:hAnsi="Aptos" w:eastAsia="Aptos"/>
+          <w:b w:val="0"/>
+          <w:color w:val="222222"/>
+          <w:sz w:val="18"/>
+        </w:rPr>
         <w:t xml:space="preserve"> | Winter 2026</w:t>
       </w:r>
     </w:p>
     <w:p>
       <w:pPr>
-        <w:pStyle w:val="BulletStyle"/>
-        <w:spacing w:before="0" w:after="0" w:line="247" w:lineRule="auto"/>
-        <w:ind w:left="245" w:hanging="187"/>
+        <w:pStyle w:val="ListBullet"/>
+        <w:spacing w:before="0" w:after="8" w:line="240" w:lineRule="auto"/>
+        <w:ind w:left="259" w:hanging="173"/>
       </w:pPr>
       <w:r>
         <w:rPr>
-          <w:b/>
+          <w:rFonts w:ascii="Aptos" w:hAnsi="Aptos" w:eastAsia="Aptos"/>
+          <w:b w:val="0"/>
+          <w:color w:val="222222"/>
+          <w:sz w:val="17"/>
         </w:rPr>
-        <w:t xml:space="preserve">• </w:t>
-      </w:r>
-      <w:r>
-        <w:rPr>
-          <w:b w:val="0"/>
-        </w:rPr>
-        <w:t xml:space="preserve">Collaborated with </w:t>
-      </w:r>
-      <w:r>
-        <w:rPr>
-          <w:b/>
-        </w:rPr>
-        <w:t>5 teammates</w:t>
-      </w:r>
-      <w:r>
-        <w:rPr>
-          <w:b w:val="0"/>
-        </w:rPr>
-        <w:t xml:space="preserve"> to deliver an integrated </w:t>
-      </w:r>
-      <w:r>
-        <w:rPr>
-          <w:b/>
-        </w:rPr>
-        <w:t>Site 1 + Site 2</w:t>
-      </w:r>
-      <w:r>
-        <w:rPr>
-          <w:b w:val="0"/>
-        </w:rPr>
-        <w:t xml:space="preserve"> capstone covering Company 1, Company 2, MSP operations, shared SAN storage, and cross-site protection.</w:t>
+        <w:t>Collaborated with 5 teammates to deliver an enterprise infrastructure capstone spanning a simulated private-cloud primary environment and simulated public-cloud secondary environment for Company 1, Company 2, MSP operations, shared SAN storage, and cross-site protection.</w:t>
       </w:r>
     </w:p>
     <w:p>
       <w:pPr>
-        <w:pStyle w:val="BulletStyle"/>
-        <w:spacing w:before="0" w:after="0" w:line="247" w:lineRule="auto"/>
-        <w:ind w:left="245" w:hanging="187"/>
+        <w:pStyle w:val="ListBullet"/>
+        <w:spacing w:before="0" w:after="8" w:line="240" w:lineRule="auto"/>
+        <w:ind w:left="259" w:hanging="173"/>
       </w:pPr>
       <w:r>
         <w:rPr>
-          <w:b/>
+          <w:rFonts w:ascii="Aptos" w:hAnsi="Aptos" w:eastAsia="Aptos"/>
+          <w:b w:val="0"/>
+          <w:color w:val="222222"/>
+          <w:sz w:val="17"/>
         </w:rPr>
-        <w:t xml:space="preserve">• </w:t>
-      </w:r>
-      <w:r>
-        <w:rPr>
-          <w:b w:val="0"/>
-        </w:rPr>
-        <w:t xml:space="preserve">Primary hands-on contribution focused on </w:t>
-      </w:r>
-      <w:r>
-        <w:rPr>
-          <w:b/>
-        </w:rPr>
-        <w:t>Site 1</w:t>
-      </w:r>
-      <w:r>
-        <w:rPr>
-          <w:b w:val="0"/>
-        </w:rPr>
-        <w:t xml:space="preserve"> on </w:t>
-      </w:r>
-      <w:r>
-        <w:rPr>
-          <w:b/>
-        </w:rPr>
-        <w:t>2 HP DL380 servers</w:t>
-      </w:r>
-      <w:r>
-        <w:rPr>
-          <w:b w:val="0"/>
-        </w:rPr>
-        <w:t>, with Site 2 retained as integrated context for MSP access, offsite protection, and recovery workflows.</w:t>
+        <w:t>Primary hands-on contribution focused on the simulated private-cloud side on 2 HP DL380 servers, with the simulated public-cloud side retained as integrated context for MSP access, offsite protection, and recovery workflows.</w:t>
       </w:r>
     </w:p>
     <w:p>
       <w:pPr>
-        <w:pStyle w:val="BulletStyle"/>
-        <w:spacing w:before="0" w:after="0" w:line="247" w:lineRule="auto"/>
-        <w:ind w:left="245" w:hanging="187"/>
+        <w:pStyle w:val="ListBullet"/>
+        <w:spacing w:before="0" w:after="8" w:line="240" w:lineRule="auto"/>
+        <w:ind w:left="259" w:hanging="173"/>
       </w:pPr>
       <w:r>
         <w:rPr>
-          <w:b/>
+          <w:rFonts w:ascii="Aptos" w:hAnsi="Aptos" w:eastAsia="Aptos"/>
+          <w:b w:val="0"/>
+          <w:color w:val="222222"/>
+          <w:sz w:val="17"/>
         </w:rPr>
-        <w:t xml:space="preserve">• </w:t>
-      </w:r>
-      <w:r>
-        <w:rPr>
-          <w:b w:val="0"/>
-        </w:rPr>
-        <w:t xml:space="preserve">Segmented </w:t>
-      </w:r>
-      <w:r>
-        <w:rPr>
-          <w:b/>
-        </w:rPr>
-        <w:t>9 VLANs</w:t>
-      </w:r>
-      <w:r>
-        <w:rPr>
-          <w:b w:val="0"/>
-        </w:rPr>
-        <w:t xml:space="preserve"> and supported </w:t>
-      </w:r>
-      <w:r>
-        <w:rPr>
-          <w:b/>
-        </w:rPr>
-        <w:t>12 documented workloads</w:t>
-      </w:r>
-      <w:r>
-        <w:rPr>
-          <w:b w:val="0"/>
-        </w:rPr>
-        <w:t xml:space="preserve"> across Proxmox VE, OPNsense, Windows Server 2022, Samba AD, Veeam, Grafana, Windows Admin Center, and Cockpit.</w:t>
+        <w:t>Segmented 9 VLANs and supported 12 documented workloads across Proxmox VE, OPNsense, Windows Server 2022, Samba AD, Veeam, Grafana, Windows Admin Center, and Cockpit.</w:t>
       </w:r>
     </w:p>
     <w:p>
       <w:pPr>
-        <w:pStyle w:val="BulletStyle"/>
-        <w:spacing w:before="0" w:after="0" w:line="247" w:lineRule="auto"/>
-        <w:ind w:left="245" w:hanging="187"/>
+        <w:pStyle w:val="ListBullet"/>
+        <w:spacing w:before="0" w:after="8" w:line="240" w:lineRule="auto"/>
+        <w:ind w:left="259" w:hanging="173"/>
       </w:pPr>
       <w:r>
         <w:rPr>
-          <w:b/>
+          <w:rFonts w:ascii="Aptos" w:hAnsi="Aptos" w:eastAsia="Aptos"/>
+          <w:b w:val="0"/>
+          <w:color w:val="222222"/>
+          <w:sz w:val="17"/>
         </w:rPr>
-        <w:t xml:space="preserve">• </w:t>
-      </w:r>
-      <w:r>
-        <w:rPr>
-          <w:b w:val="0"/>
-        </w:rPr>
-        <w:t xml:space="preserve">Implemented </w:t>
-      </w:r>
-      <w:r>
-        <w:rPr>
-          <w:b/>
-        </w:rPr>
-        <w:t>Site 1 tenant-separated identity, DNS, DHCP, DMZ web, file-service, and SAN/iSCSI workflows</w:t>
-      </w:r>
-      <w:r>
-        <w:rPr>
-          <w:b w:val="0"/>
-        </w:rPr>
-        <w:t xml:space="preserve"> while preserving approved management paths and bounded security exposure.</w:t>
+        <w:t>Implemented simulated private-cloud tenant-separated identity, DNS, DHCP, DMZ web, file-service, and SAN/iSCSI workflows while preserving approved management paths and bounded security exposure.</w:t>
       </w:r>
     </w:p>
     <w:p>
       <w:pPr>
-        <w:pStyle w:val="BulletStyle"/>
-        <w:spacing w:before="0" w:after="0" w:line="247" w:lineRule="auto"/>
-        <w:ind w:left="245" w:hanging="187"/>
+        <w:pStyle w:val="ListBullet"/>
+        <w:spacing w:before="0" w:after="8" w:line="240" w:lineRule="auto"/>
+        <w:ind w:left="259" w:hanging="173"/>
       </w:pPr>
       <w:r>
         <w:rPr>
-          <w:b/>
+          <w:rFonts w:ascii="Aptos" w:hAnsi="Aptos" w:eastAsia="Aptos"/>
+          <w:b w:val="0"/>
+          <w:color w:val="222222"/>
+          <w:sz w:val="17"/>
         </w:rPr>
-        <w:t xml:space="preserve">• </w:t>
-      </w:r>
-      <w:r>
-        <w:rPr>
-          <w:b w:val="0"/>
-        </w:rPr>
-        <w:t xml:space="preserve">Protected </w:t>
-      </w:r>
-      <w:r>
-        <w:rPr>
-          <w:b/>
-        </w:rPr>
-        <w:t>10 Site 1 systems</w:t>
-      </w:r>
-      <w:r>
-        <w:rPr>
-          <w:b w:val="0"/>
-        </w:rPr>
-        <w:t xml:space="preserve"> and copied </w:t>
-      </w:r>
-      <w:r>
-        <w:rPr>
-          <w:b/>
-        </w:rPr>
-        <w:t>7 selected backup jobs offsite</w:t>
-      </w:r>
-      <w:r>
-        <w:rPr>
-          <w:b w:val="0"/>
-        </w:rPr>
-        <w:t xml:space="preserve"> over site-to-site OpenVPN; incorporated the broader </w:t>
-      </w:r>
-      <w:r>
-        <w:rPr>
-          <w:b/>
-        </w:rPr>
-        <w:t>Site 2 MSP access and recovery context</w:t>
-      </w:r>
-      <w:r>
-        <w:rPr>
-          <w:b w:val="0"/>
-        </w:rPr>
-        <w:t xml:space="preserve"> into a </w:t>
-      </w:r>
-      <w:r>
-        <w:rPr>
-          <w:b/>
-        </w:rPr>
-        <w:t>109-page integrated technical handover</w:t>
-      </w:r>
-      <w:r>
-        <w:rPr>
-          <w:b w:val="0"/>
-        </w:rPr>
-        <w:t>.</w:t>
+        <w:t>Protected 10 systems on the simulated private-cloud side and copied 7 selected backup jobs to the simulated public-cloud side over site-to-site OpenVPN; documented the broader MSP access and recovery model in a 109-page integrated technical handover.</w:t>
       </w:r>
     </w:p>
     <w:p>
       <w:pPr>
-        <w:pStyle w:val="BulletStyle"/>
-        <w:spacing w:before="0" w:after="0" w:line="247" w:lineRule="auto"/>
-        <w:ind w:left="245" w:hanging="187"/>
+        <w:pStyle w:val="ListBullet"/>
+        <w:spacing w:before="0" w:after="8" w:line="240" w:lineRule="auto"/>
+        <w:ind w:left="259" w:hanging="173"/>
       </w:pPr>
       <w:r>
         <w:rPr>
-          <w:b/>
+          <w:rFonts w:ascii="Aptos" w:hAnsi="Aptos" w:eastAsia="Aptos"/>
+          <w:b w:val="0"/>
+          <w:color w:val="222222"/>
+          <w:sz w:val="17"/>
         </w:rPr>
-        <w:t xml:space="preserve">• </w:t>
-      </w:r>
-      <w:r>
-        <w:rPr>
-          <w:b w:val="0"/>
-        </w:rPr>
-        <w:t xml:space="preserve">Published a </w:t>
-      </w:r>
-      <w:r>
-        <w:rPr>
-          <w:b/>
-        </w:rPr>
-        <w:t>sanitized portfolio and GitHub project</w:t>
-      </w:r>
-      <w:r>
-        <w:rPr>
-          <w:b w:val="0"/>
-        </w:rPr>
-        <w:t xml:space="preserve"> to explain Site 1 delivery, Site 2 integration context, validation logic, failure-domain thinking, and support documentation for recruiters and hiring teams.</w:t>
+        <w:t>Published a sanitized portfolio and GitHub project to explain the simulated private-cloud delivery, simulated public-cloud extension, validation logic, failure-domain thinking, and support documentation for recruiters and hiring teams.</w:t>
       </w:r>
     </w:p>
     <w:p>
       <w:pPr>
-        <w:pStyle w:val="SectionStyle"/>
-        <w:spacing w:before="80" w:after="20" w:line="240" w:lineRule="auto"/>
+        <w:spacing w:before="60" w:after="30" w:line="240" w:lineRule="auto"/>
       </w:pPr>
       <w:r>
+        <w:rPr>
+          <w:rFonts w:ascii="Aptos" w:hAnsi="Aptos" w:eastAsia="Aptos"/>
+          <w:b/>
+          <w:color w:val="4285F4"/>
+          <w:sz w:val="19"/>
+        </w:rPr>
         <w:t>TECHNICAL SKILLS</w:t>
       </w:r>
     </w:p>
     <w:p>
       <w:pPr>
-        <w:pStyle w:val="BodyStyle"/>
-        <w:spacing w:before="20" w:after="0" w:line="245" w:lineRule="auto"/>
+        <w:spacing w:before="0" w:after="4" w:line="240" w:lineRule="auto"/>
       </w:pPr>
       <w:r>
         <w:rPr>
+          <w:rFonts w:ascii="Aptos" w:hAnsi="Aptos" w:eastAsia="Aptos"/>
           <w:b/>
+          <w:color w:val="222222"/>
+          <w:sz w:val="18"/>
         </w:rPr>
-        <w:t xml:space="preserve">Infrastructure: </w:t>
+        <w:t>Infrastructure:</w:t>
       </w:r>
       <w:r>
-        <w:t>Proxmox VE, Windows Server 2022, Ubuntu, Red Hat/CentOS, Alpine Linux, Windows 10/11</w:t>
+        <w:rPr>
+          <w:rFonts w:ascii="Aptos" w:hAnsi="Aptos" w:eastAsia="Aptos"/>
+          <w:b w:val="0"/>
+          <w:color w:val="222222"/>
+          <w:sz w:val="18"/>
+        </w:rPr>
+        <w:t xml:space="preserve"> Proxmox VE, Windows Server 2022, Ubuntu, Red Hat/CentOS, Alpine Linux, Windows 10/11</w:t>
       </w:r>
     </w:p>
     <w:p>
       <w:pPr>
-        <w:pStyle w:val="BodyStyle"/>
-        <w:spacing w:before="0" w:after="0" w:line="245" w:lineRule="auto"/>
+        <w:spacing w:before="0" w:after="4" w:line="240" w:lineRule="auto"/>
       </w:pPr>
       <w:r>
         <w:rPr>
+          <w:rFonts w:ascii="Aptos" w:hAnsi="Aptos" w:eastAsia="Aptos"/>
           <w:b/>
+          <w:color w:val="222222"/>
+          <w:sz w:val="18"/>
         </w:rPr>
-        <w:t xml:space="preserve">Networking: </w:t>
+        <w:t>Networking:</w:t>
       </w:r>
       <w:r>
-        <w:t>OPNsense/pfSense, Cisco IOS, ArubaOS, VLANs, OSPF, STP, TCP/IP, DNS, DHCP, VPN, NAT, DMZ</w:t>
+        <w:rPr>
+          <w:rFonts w:ascii="Aptos" w:hAnsi="Aptos" w:eastAsia="Aptos"/>
+          <w:b w:val="0"/>
+          <w:color w:val="222222"/>
+          <w:sz w:val="18"/>
+        </w:rPr>
+        <w:t xml:space="preserve"> OPNsense/pfSense, Cisco IOS, ArubaOS, VLANs, OSPF, STP, TCP/IP, DNS, DHCP, VPN, NAT, DMZ</w:t>
       </w:r>
     </w:p>
     <w:p>
       <w:pPr>
-        <w:pStyle w:val="BodyStyle"/>
-        <w:spacing w:before="0" w:after="0" w:line="245" w:lineRule="auto"/>
+        <w:spacing w:before="0" w:after="4" w:line="240" w:lineRule="auto"/>
       </w:pPr>
       <w:r>
         <w:rPr>
+          <w:rFonts w:ascii="Aptos" w:hAnsi="Aptos" w:eastAsia="Aptos"/>
           <w:b/>
+          <w:color w:val="222222"/>
+          <w:sz w:val="18"/>
         </w:rPr>
-        <w:t xml:space="preserve">Administration &amp; Tools: </w:t>
+        <w:t>Administration &amp; Tools:</w:t>
       </w:r>
       <w:r>
-        <w:t>AD DS, GPO, Samba AD, iSCSI, Veeam Backup &amp; Replication, Grafana, InfluxDB, Windows Admin Center, Cockpit, Wireshark, Microsoft 365</w:t>
+        <w:rPr>
+          <w:rFonts w:ascii="Aptos" w:hAnsi="Aptos" w:eastAsia="Aptos"/>
+          <w:b w:val="0"/>
+          <w:color w:val="222222"/>
+          <w:sz w:val="18"/>
+        </w:rPr>
+        <w:t xml:space="preserve"> AD DS, GPO, Samba AD, iSCSI, Veeam Backup &amp; Replication, Grafana, InfluxDB, Windows Admin Center, Cockpit, Wireshark, Microsoft 365</w:t>
       </w:r>
     </w:p>
     <w:p>
       <w:pPr>
-        <w:pStyle w:val="SectionStyle"/>
-        <w:spacing w:before="80" w:after="20" w:line="240" w:lineRule="auto"/>
+        <w:spacing w:before="60" w:after="30" w:line="240" w:lineRule="auto"/>
       </w:pPr>
       <w:r>
+        <w:rPr>
+          <w:rFonts w:ascii="Aptos" w:hAnsi="Aptos" w:eastAsia="Aptos"/>
+          <w:b/>
+          <w:color w:val="4285F4"/>
+          <w:sz w:val="19"/>
+        </w:rPr>
         <w:t>ADDITIONAL EXPERIENCE</w:t>
       </w:r>
     </w:p>
     <w:p>
       <w:pPr>
-        <w:pStyle w:val="BodyStyle"/>
-        <w:spacing w:before="20" w:after="0" w:line="245" w:lineRule="auto"/>
+        <w:spacing w:before="0" w:after="6" w:line="240" w:lineRule="auto"/>
       </w:pPr>
       <w:r>
         <w:rPr>
+          <w:rFonts w:ascii="Aptos" w:hAnsi="Aptos" w:eastAsia="Aptos"/>
           <w:b/>
+          <w:color w:val="222222"/>
+          <w:sz w:val="18"/>
         </w:rPr>
-        <w:t>Senior Business Representative, Winbond Integrated Circuit (Suzhou) Co., Ltd</w:t>
+        <w:t>Senior Business Representative</w:t>
       </w:r>
       <w:r>
-        <w:t xml:space="preserve"> | 2018-2022</w:t>
+        <w:rPr>
+          <w:rFonts w:ascii="Aptos" w:hAnsi="Aptos" w:eastAsia="Aptos"/>
+          <w:b w:val="0"/>
+          <w:color w:val="222222"/>
+          <w:sz w:val="18"/>
+        </w:rPr>
+        <w:t>, Winbond Integrated Circuit (Suzhou) Co., Ltd | 2018-2022</w:t>
       </w:r>
     </w:p>
     <w:p>
       <w:pPr>
-        <w:pStyle w:val="BulletStyle"/>
-        <w:spacing w:before="0" w:after="0" w:line="247" w:lineRule="auto"/>
-        <w:ind w:left="245" w:hanging="187"/>
+        <w:pStyle w:val="ListBullet"/>
+        <w:spacing w:before="0" w:after="8" w:line="240" w:lineRule="auto"/>
+        <w:ind w:left="259" w:hanging="173"/>
       </w:pPr>
       <w:r>
         <w:rPr>
-          <w:b/>
+          <w:rFonts w:ascii="Aptos" w:hAnsi="Aptos" w:eastAsia="Aptos"/>
+          <w:b w:val="0"/>
+          <w:color w:val="222222"/>
+          <w:sz w:val="17"/>
         </w:rPr>
-        <w:t xml:space="preserve">• </w:t>
-      </w:r>
-      <w:r>
-        <w:rPr>
-          <w:b w:val="0"/>
-        </w:rPr>
-        <w:t xml:space="preserve">Improved </w:t>
-      </w:r>
-      <w:r>
-        <w:rPr>
-          <w:b/>
-        </w:rPr>
-        <w:t>on-time delivery by 25%</w:t>
-      </w:r>
-      <w:r>
-        <w:rPr>
-          <w:b w:val="0"/>
-        </w:rPr>
-        <w:t xml:space="preserve"> by aligning supply planning with customer demand, factory constraints, and R&amp;D priorities across IoT, wearables, and networking product lines.</w:t>
+        <w:t>Improved on-time delivery by 25% by aligning supply planning with customer demand, factory constraints, and R&amp;D priorities across IoT, wearables, and networking product lines.</w:t>
       </w:r>
     </w:p>
     <w:p>
       <w:pPr>
-        <w:pStyle w:val="BulletStyle"/>
-        <w:spacing w:before="0" w:after="0" w:line="247" w:lineRule="auto"/>
-        <w:ind w:left="245" w:hanging="187"/>
+        <w:pStyle w:val="ListBullet"/>
+        <w:spacing w:before="0" w:after="8" w:line="240" w:lineRule="auto"/>
+        <w:ind w:left="259" w:hanging="173"/>
       </w:pPr>
       <w:r>
         <w:rPr>
-          <w:b/>
+          <w:rFonts w:ascii="Aptos" w:hAnsi="Aptos" w:eastAsia="Aptos"/>
+          <w:b w:val="0"/>
+          <w:color w:val="222222"/>
+          <w:sz w:val="17"/>
         </w:rPr>
-        <w:t xml:space="preserve">• </w:t>
-      </w:r>
-      <w:r>
-        <w:rPr>
-          <w:b w:val="0"/>
-        </w:rPr>
-        <w:t xml:space="preserve">Identified </w:t>
-      </w:r>
-      <w:r>
-        <w:rPr>
-          <w:b/>
-        </w:rPr>
-        <w:t>new opportunities in IoT, wearables, and networking markets</w:t>
-      </w:r>
-      <w:r>
-        <w:rPr>
-          <w:b w:val="0"/>
-        </w:rPr>
-        <w:t xml:space="preserve"> and coordinated cross-functional teams to align roadmap, demand, and customer requirements.</w:t>
+        <w:t>Identified new opportunities in IoT, wearables, and networking markets and coordinated cross-functional teams to align roadmap, demand, and customer requirements.</w:t>
       </w:r>
     </w:p>
     <w:p>
       <w:pPr>
-        <w:pStyle w:val="BodyStyle"/>
-        <w:spacing w:before="20" w:after="0" w:line="245" w:lineRule="auto"/>
+        <w:spacing w:before="0" w:after="4" w:line="240" w:lineRule="auto"/>
+      </w:pPr>
+    </w:p>
+    <w:p>
+      <w:pPr>
+        <w:spacing w:before="0" w:after="6" w:line="240" w:lineRule="auto"/>
       </w:pPr>
       <w:r>
         <w:rPr>
+          <w:rFonts w:ascii="Aptos" w:hAnsi="Aptos" w:eastAsia="Aptos"/>
           <w:b/>
+          <w:color w:val="222222"/>
+          <w:sz w:val="18"/>
         </w:rPr>
-        <w:t>Resource Development Manager, Shanghai Uniscope Electronics Co., Ltd</w:t>
+        <w:t>Resource Development Manager</w:t>
       </w:r>
       <w:r>
-        <w:t xml:space="preserve"> | 2009-2018</w:t>
+        <w:rPr>
+          <w:rFonts w:ascii="Aptos" w:hAnsi="Aptos" w:eastAsia="Aptos"/>
+          <w:b w:val="0"/>
+          <w:color w:val="222222"/>
+          <w:sz w:val="18"/>
+        </w:rPr>
+        <w:t>, Shanghai Uniscope Electronics Co., Ltd | 2009-2018</w:t>
       </w:r>
     </w:p>
     <w:p>
       <w:pPr>
-        <w:pStyle w:val="BulletStyle"/>
-        <w:spacing w:before="0" w:after="0" w:line="247" w:lineRule="auto"/>
-        <w:ind w:left="245" w:hanging="187"/>
+        <w:pStyle w:val="ListBullet"/>
+        <w:spacing w:before="0" w:after="8" w:line="240" w:lineRule="auto"/>
+        <w:ind w:left="259" w:hanging="173"/>
       </w:pPr>
       <w:r>
         <w:rPr>
-          <w:b/>
+          <w:rFonts w:ascii="Aptos" w:hAnsi="Aptos" w:eastAsia="Aptos"/>
+          <w:b w:val="0"/>
+          <w:color w:val="222222"/>
+          <w:sz w:val="17"/>
         </w:rPr>
-        <w:t xml:space="preserve">• </w:t>
-      </w:r>
-      <w:r>
-        <w:rPr>
-          <w:b w:val="0"/>
-        </w:rPr>
-        <w:t xml:space="preserve">Increased </w:t>
-      </w:r>
-      <w:r>
-        <w:rPr>
-          <w:b/>
-        </w:rPr>
-        <w:t>operational efficiency by 20%</w:t>
-      </w:r>
-      <w:r>
-        <w:rPr>
-          <w:b w:val="0"/>
-        </w:rPr>
-        <w:t xml:space="preserve">, reduced </w:t>
-      </w:r>
-      <w:r>
-        <w:rPr>
-          <w:b/>
-        </w:rPr>
-        <w:t>procurement costs by 5%</w:t>
-      </w:r>
-      <w:r>
-        <w:rPr>
-          <w:b w:val="0"/>
-        </w:rPr>
-        <w:t xml:space="preserve">, and shortened </w:t>
-      </w:r>
-      <w:r>
-        <w:rPr>
-          <w:b/>
-        </w:rPr>
-        <w:t>lead times by 15%</w:t>
-      </w:r>
-      <w:r>
-        <w:rPr>
-          <w:b w:val="0"/>
-        </w:rPr>
-        <w:t xml:space="preserve"> by improving supplier management, shortage response, and purchasing workflows.</w:t>
+        <w:t>Increased operational efficiency by 20%, reduced procurement costs by 5%, and shortened lead times by 15% by improving supplier management, shortage response, and purchasing workflows.</w:t>
       </w:r>
     </w:p>
     <w:p>
       <w:pPr>
-        <w:pStyle w:val="BulletStyle"/>
-        <w:spacing w:before="0" w:after="0" w:line="247" w:lineRule="auto"/>
-        <w:ind w:left="245" w:hanging="187"/>
+        <w:pStyle w:val="ListBullet"/>
+        <w:spacing w:before="0" w:after="8" w:line="240" w:lineRule="auto"/>
+        <w:ind w:left="259" w:hanging="173"/>
       </w:pPr>
       <w:r>
         <w:rPr>
-          <w:b/>
+          <w:rFonts w:ascii="Aptos" w:hAnsi="Aptos" w:eastAsia="Aptos"/>
+          <w:b w:val="0"/>
+          <w:color w:val="222222"/>
+          <w:sz w:val="17"/>
         </w:rPr>
-        <w:t xml:space="preserve">• </w:t>
+        <w:t>Reduced supply-chain disruptions by 8% and improved supplier performance by 10% through stronger vendor management, inventory control, and escalation handling.</w:t>
       </w:r>
-      <w:r>
-        <w:rPr>
-          <w:b w:val="0"/>
-        </w:rPr>
-        <w:t xml:space="preserve">Reduced </w:t>
-      </w:r>
-      <w:r>
-        <w:rPr>
-          <w:b/>
-        </w:rPr>
-        <w:t>supply-chain disruptions by 8%</w:t>
-      </w:r>
-      <w:r>
-        <w:rPr>
-          <w:b w:val="0"/>
-        </w:rPr>
-        <w:t xml:space="preserve"> and improved </w:t>
-      </w:r>
-      <w:r>
-        <w:rPr>
-          <w:b/>
-        </w:rPr>
-        <w:t>supplier performance by 10%</w:t>
-      </w:r>
-      <w:r>
-        <w:rPr>
-          <w:b w:val="0"/>
-        </w:rPr>
-        <w:t xml:space="preserve"> through stronger vendor management, inventory control, and escalation handling.</w:t>
-      </w:r>
+    </w:p>
+    <w:p>
+      <w:pPr>
+        <w:spacing w:before="0" w:after="0" w:line="240" w:lineRule="auto"/>
+      </w:pPr>
     </w:p>
     <w:sectPr>
       <w:pgSz w:w="12240" w:h="15840"/>
-      <w:pgMar w:top="605" w:right="720" w:bottom="605" w:left="720" w:header="720" w:footer="720" w:gutter="0"/>
+      <w:pgMar w:top="547" w:right="691" w:bottom="547" w:left="691" w:header="288" w:footer="288" w:gutter="0"/>
       <w:cols w:space="720"/>
       <w:docGrid w:linePitch="360"/>
     </w:sectPr>
@@ -1017,7 +925,8 @@
     <w:rsid w:val="00FC693F"/>
     <w:rPr>
       <w:rFonts w:ascii="Aptos" w:hAnsi="Aptos" w:eastAsia="Aptos"/>
-      <w:sz w:val="20"/>
+      <w:color w:val="222222"/>
+      <w:sz w:val="18"/>
     </w:rPr>
   </w:style>
   <w:style w:type="paragraph" w:styleId="Header">
@@ -12701,76 +12610,6 @@
         <w:shd w:val="clear" w:color="auto" w:fill="FBCAA2" w:themeFill="accent6" w:themeFillTint="7F"/>
       </w:tcPr>
     </w:tblStylePr>
-  </w:style>
-  <w:style w:type="paragraph" w:customStyle="1" w:styleId="NameStyle">
-    <w:name w:val="NameStyle"/>
-    <w:rPr>
-      <w:rFonts w:ascii="Aptos" w:hAnsi="Aptos" w:eastAsia="Aptos"/>
-      <w:b/>
-      <w:i w:val="0"/>
-      <w:color w:val="1A73E8"/>
-      <w:sz w:val="36"/>
-    </w:rPr>
-  </w:style>
-  <w:style w:type="paragraph" w:customStyle="1" w:styleId="ContactStyle">
-    <w:name w:val="ContactStyle"/>
-    <w:rPr>
-      <w:rFonts w:ascii="Aptos" w:hAnsi="Aptos" w:eastAsia="Aptos"/>
-      <w:b w:val="0"/>
-      <w:i w:val="0"/>
-      <w:color w:val="5F6368"/>
-      <w:sz w:val="18"/>
-    </w:rPr>
-  </w:style>
-  <w:style w:type="paragraph" w:customStyle="1" w:styleId="TagStyle">
-    <w:name w:val="TagStyle"/>
-    <w:rPr>
-      <w:rFonts w:ascii="Aptos" w:hAnsi="Aptos" w:eastAsia="Aptos"/>
-      <w:b w:val="0"/>
-      <w:i/>
-      <w:color w:val="1F1F1F"/>
-      <w:sz w:val="20"/>
-    </w:rPr>
-  </w:style>
-  <w:style w:type="paragraph" w:customStyle="1" w:styleId="SectionStyle">
-    <w:name w:val="SectionStyle"/>
-    <w:rPr>
-      <w:rFonts w:ascii="Aptos" w:hAnsi="Aptos" w:eastAsia="Aptos"/>
-      <w:b/>
-      <w:i w:val="0"/>
-      <w:color w:val="1A73E8"/>
-      <w:sz w:val="20"/>
-    </w:rPr>
-  </w:style>
-  <w:style w:type="paragraph" w:customStyle="1" w:styleId="BodyStyle">
-    <w:name w:val="BodyStyle"/>
-    <w:rPr>
-      <w:rFonts w:ascii="Aptos" w:hAnsi="Aptos" w:eastAsia="Aptos"/>
-      <w:b w:val="0"/>
-      <w:i w:val="0"/>
-      <w:color w:val="1F1F1F"/>
-      <w:sz w:val="20"/>
-    </w:rPr>
-  </w:style>
-  <w:style w:type="paragraph" w:customStyle="1" w:styleId="BulletStyle">
-    <w:name w:val="BulletStyle"/>
-    <w:rPr>
-      <w:rFonts w:ascii="Aptos" w:hAnsi="Aptos" w:eastAsia="Aptos"/>
-      <w:b w:val="0"/>
-      <w:i w:val="0"/>
-      <w:color w:val="1F1F1F"/>
-      <w:sz w:val="19"/>
-    </w:rPr>
-  </w:style>
-  <w:style w:type="paragraph" w:customStyle="1" w:styleId="SummaryStyle">
-    <w:name w:val="SummaryStyle"/>
-    <w:rPr>
-      <w:rFonts w:ascii="Aptos" w:hAnsi="Aptos" w:eastAsia="Aptos"/>
-      <w:b w:val="0"/>
-      <w:i w:val="0"/>
-      <w:color w:val="1F1F1F"/>
-      <w:sz w:val="20"/>
-    </w:rPr>
   </w:style>
 </w:styles>
 </file>

</xml_diff>

<commit_message>
Clean resume paragraph markers
</commit_message>
<xml_diff>
--- a/assets/Yiqin_Huang_Resume_One_Page.docx
+++ b/assets/Yiqin_Huang_Resume_One_Page.docx
@@ -4,7 +4,6 @@
   <w:body>
     <w:p>
       <w:pPr>
-        <w:keepLines/>
         <w:spacing w:after="16" w:line="470" w:lineRule="exact"/>
         <w:jc w:val="center"/>
       </w:pPr>
@@ -20,7 +19,6 @@
     </w:p>
     <w:p>
       <w:pPr>
-        <w:keepLines/>
         <w:spacing w:after="7" w:line="245" w:lineRule="exact"/>
         <w:jc w:val="center"/>
       </w:pPr>
@@ -33,7 +31,6 @@
     </w:p>
     <w:p>
       <w:pPr>
-        <w:keepLines/>
         <w:spacing w:after="7" w:line="243" w:lineRule="exact"/>
         <w:jc w:val="center"/>
       </w:pPr>
@@ -46,7 +43,6 @@
     </w:p>
     <w:p>
       <w:pPr>
-        <w:keepLines/>
         <w:pBdr>
           <w:bottom w:val="single" w:sz="10" w:space="1" w:color="C6DAFC"/>
         </w:pBdr>
@@ -63,8 +59,6 @@
     </w:p>
     <w:p>
       <w:pPr>
-        <w:keepNext/>
-        <w:keepLines/>
         <w:pBdr>
           <w:bottom w:val="single" w:sz="8" w:space="1" w:color="D8E8FF"/>
         </w:pBdr>
@@ -81,7 +75,6 @@
     </w:p>
     <w:p>
       <w:pPr>
-        <w:keepLines/>
         <w:spacing w:after="32"/>
       </w:pPr>
       <w:r>
@@ -108,8 +101,6 @@
     </w:p>
     <w:p>
       <w:pPr>
-        <w:keepNext/>
-        <w:keepLines/>
         <w:pBdr>
           <w:bottom w:val="single" w:sz="8" w:space="1" w:color="D8E8FF"/>
         </w:pBdr>
@@ -126,7 +117,6 @@
     </w:p>
     <w:p>
       <w:pPr>
-        <w:keepLines/>
         <w:spacing w:after="6" w:line="250" w:lineRule="exact"/>
       </w:pPr>
       <w:r>
@@ -138,7 +128,6 @@
     </w:p>
     <w:p>
       <w:pPr>
-        <w:keepLines/>
         <w:spacing w:after="4" w:line="250" w:lineRule="exact"/>
       </w:pPr>
       <w:r>
@@ -153,7 +142,6 @@
     </w:p>
     <w:p>
       <w:pPr>
-        <w:keepLines/>
         <w:spacing w:after="13" w:line="250" w:lineRule="exact"/>
       </w:pPr>
       <w:r>
@@ -168,7 +156,6 @@
     </w:p>
     <w:p>
       <w:pPr>
-        <w:keepLines/>
         <w:spacing w:after="6" w:line="250" w:lineRule="exact"/>
       </w:pPr>
       <w:r>
@@ -180,8 +167,6 @@
     </w:p>
     <w:p>
       <w:pPr>
-        <w:keepNext/>
-        <w:keepLines/>
         <w:spacing w:after="18" w:line="250" w:lineRule="exact"/>
       </w:pPr>
       <w:r>
@@ -190,7 +175,6 @@
     </w:p>
     <w:p>
       <w:pPr>
-        <w:keepLines/>
         <w:pBdr>
           <w:bottom w:val="single" w:sz="8" w:space="1" w:color="D8E8FF"/>
         </w:pBdr>
@@ -207,7 +191,6 @@
     </w:p>
     <w:p>
       <w:pPr>
-        <w:keepLines/>
         <w:spacing w:after="7" w:line="250" w:lineRule="exact"/>
       </w:pPr>
       <w:r>
@@ -220,7 +203,6 @@
     <w:p>
       <w:pPr>
         <w:pStyle w:val="ListBullet"/>
-        <w:keepLines/>
         <w:spacing w:after="18"/>
         <w:ind w:left="302" w:hanging="202"/>
       </w:pPr>
@@ -240,8 +222,6 @@
     <w:p>
       <w:pPr>
         <w:pStyle w:val="ListBullet"/>
-        <w:keepNext/>
-        <w:keepLines/>
         <w:spacing w:after="18"/>
         <w:ind w:left="302" w:hanging="202"/>
       </w:pPr>
@@ -261,7 +241,6 @@
     <w:p>
       <w:pPr>
         <w:pStyle w:val="ListBullet"/>
-        <w:keepLines/>
         <w:spacing w:after="18"/>
         <w:ind w:left="302" w:hanging="202"/>
       </w:pPr>
@@ -290,7 +269,6 @@
     <w:p>
       <w:pPr>
         <w:pStyle w:val="ListBullet"/>
-        <w:keepLines/>
         <w:spacing w:after="18"/>
         <w:ind w:left="302" w:hanging="202"/>
       </w:pPr>
@@ -301,7 +279,6 @@
     <w:p>
       <w:pPr>
         <w:pStyle w:val="ListBullet"/>
-        <w:keepLines/>
         <w:spacing w:after="18"/>
         <w:ind w:left="302" w:hanging="202"/>
       </w:pPr>
@@ -330,8 +307,6 @@
     <w:p>
       <w:pPr>
         <w:pStyle w:val="ListBullet"/>
-        <w:keepNext/>
-        <w:keepLines/>
         <w:spacing w:after="18"/>
         <w:ind w:left="302" w:hanging="202"/>
       </w:pPr>
@@ -341,7 +316,6 @@
     </w:p>
     <w:p>
       <w:pPr>
-        <w:keepLines/>
         <w:pBdr>
           <w:bottom w:val="single" w:sz="8" w:space="1" w:color="D8E8FF"/>
         </w:pBdr>
@@ -358,7 +332,6 @@
     </w:p>
     <w:p>
       <w:pPr>
-        <w:keepLines/>
         <w:spacing w:after="4" w:line="250" w:lineRule="exact"/>
       </w:pPr>
       <w:r>
@@ -373,7 +346,6 @@
     </w:p>
     <w:p>
       <w:pPr>
-        <w:keepLines/>
         <w:spacing w:after="4" w:line="250" w:lineRule="exact"/>
       </w:pPr>
       <w:r>
@@ -388,7 +360,6 @@
     </w:p>
     <w:p>
       <w:pPr>
-        <w:keepLines/>
         <w:spacing w:after="16" w:line="250" w:lineRule="exact"/>
       </w:pPr>
       <w:r>
@@ -403,7 +374,6 @@
     </w:p>
     <w:p>
       <w:pPr>
-        <w:keepLines/>
         <w:pBdr>
           <w:bottom w:val="single" w:sz="8" w:space="1" w:color="D8E8FF"/>
         </w:pBdr>
@@ -420,7 +390,6 @@
     </w:p>
     <w:p>
       <w:pPr>
-        <w:keepLines/>
         <w:spacing w:after="6" w:line="250" w:lineRule="exact"/>
       </w:pPr>
       <w:r>
@@ -433,7 +402,6 @@
     <w:p>
       <w:pPr>
         <w:pStyle w:val="ListBullet"/>
-        <w:keepLines/>
         <w:spacing w:after="18"/>
         <w:ind w:left="302" w:hanging="202"/>
       </w:pPr>
@@ -453,7 +421,6 @@
     <w:p>
       <w:pPr>
         <w:pStyle w:val="ListBullet"/>
-        <w:keepLines/>
         <w:spacing w:after="18"/>
         <w:ind w:left="302" w:hanging="202"/>
       </w:pPr>
@@ -463,7 +430,6 @@
     </w:p>
     <w:p>
       <w:pPr>
-        <w:keepLines/>
         <w:spacing w:after="6" w:line="250" w:lineRule="exact"/>
       </w:pPr>
       <w:r>
@@ -476,7 +442,6 @@
     <w:p>
       <w:pPr>
         <w:pStyle w:val="ListBullet"/>
-        <w:keepLines/>
         <w:spacing w:after="18"/>
         <w:ind w:left="302" w:hanging="202"/>
       </w:pPr>
@@ -514,7 +479,6 @@
     <w:p>
       <w:pPr>
         <w:pStyle w:val="ListBullet"/>
-        <w:keepLines/>
         <w:spacing w:after="18"/>
         <w:ind w:left="302" w:hanging="202"/>
       </w:pPr>

</xml_diff>

<commit_message>
Update downloadable resume to professional layout
</commit_message>
<xml_diff>
--- a/assets/Yiqin_Huang_Resume_One_Page.docx
+++ b/assets/Yiqin_Huang_Resume_One_Page.docx
@@ -4,65 +4,51 @@
   <w:body>
     <w:p>
       <w:pPr>
-        <w:spacing w:after="16" w:line="470" w:lineRule="exact"/>
-        <w:jc w:val="center"/>
+        <w:spacing w:after="14" w:line="440" w:lineRule="exact"/>
       </w:pPr>
       <w:r>
         <w:rPr>
           <w:rFonts w:ascii="Aptos Display" w:eastAsia="Aptos Display" w:hAnsi="Aptos Display"/>
           <w:b/>
           <w:color w:val="1A73E8"/>
-          <w:sz w:val="41"/>
+          <w:sz w:val="40"/>
         </w:rPr>
         <w:t>Yiqin Huang</w:t>
       </w:r>
     </w:p>
     <w:p>
       <w:pPr>
-        <w:spacing w:after="7" w:line="245" w:lineRule="exact"/>
-        <w:jc w:val="center"/>
+        <w:spacing w:after="4" w:line="264" w:lineRule="exact"/>
       </w:pPr>
       <w:r>
         <w:rPr>
-          <w:color w:val="56606E"/>
+          <w:b/>
+          <w:sz w:val="21"/>
         </w:rPr>
-        <w:t>Ottawa, ON | 613-608-9256 | huangstephen3@gmail.com</w:t>
-      </w:r>
-    </w:p>
-    <w:p>
-      <w:pPr>
-        <w:spacing w:after="7" w:line="243" w:lineRule="exact"/>
-        <w:jc w:val="center"/>
-      </w:pPr>
-      <w:r>
-        <w:rPr>
-          <w:color w:val="56606E"/>
-        </w:rPr>
-        <w:t>LinkedIn: linkedin.com/in/yiqinhuang2025 | Portfolio: https://huangstephen3.github.io</w:t>
+        <w:t>Computer Systems Technician - Networking Student</w:t>
       </w:r>
     </w:p>
     <w:p>
       <w:pPr>
         <w:pBdr>
-          <w:bottom w:val="single" w:sz="10" w:space="1" w:color="C6DAFC"/>
+          <w:bottom w:val="single" w:sz="10" w:space="2" w:color="C6DAFC"/>
         </w:pBdr>
-        <w:spacing w:after="90" w:line="251" w:lineRule="exact"/>
-        <w:jc w:val="center"/>
+        <w:spacing w:after="80" w:line="248" w:lineRule="exact"/>
       </w:pPr>
       <w:r>
         <w:rPr>
-          <w:b/>
-          <w:sz w:val="19"/>
+          <w:color w:val="4B5563"/>
+          <w:sz w:val="18"/>
         </w:rPr>
-        <w:t>Computer Systems Technician - Networking Student | Seeking Junior Systems / Network Support Roles</w:t>
+        <w:t>Ottawa, ON  |  613-608-9256  |  huangstephen3@gmail.com  |  linkedin.com/in/yiqinhuang2025  |  huangstephen3.github.io</w:t>
       </w:r>
     </w:p>
     <w:p>
       <w:pPr>
         <w:pBdr>
-          <w:bottom w:val="single" w:sz="8" w:space="1" w:color="D8E8FF"/>
+          <w:bottom w:val="single" w:sz="8" w:space="1" w:color="D6E3F7"/>
         </w:pBdr>
-        <w:spacing w:before="90" w:after="36" w:line="260" w:lineRule="exact"/>
+        <w:spacing w:before="100" w:after="36" w:line="256" w:lineRule="exact"/>
       </w:pPr>
       <w:r>
         <w:rPr>
@@ -87,7 +73,7 @@
         <w:t>GPA 3.99/4.0</w:t>
       </w:r>
       <w:r>
-        <w:t xml:space="preserve">) with hands-on implementation experience in an integrated enterprise infrastructure capstone spanning a simulated private-cloud primary environment, multi-tenant services, storage, monitoring, backup, and cross-site protection. Brings </w:t>
+        <w:t xml:space="preserve">) with hands-on implementation experience in an enterprise infrastructure capstone covering multi-tenant services, storage, monitoring, backup, and cross-site protection. Combines recent systems/network training with </w:t>
       </w:r>
       <w:r>
         <w:rPr>
@@ -96,15 +82,15 @@
         <w:t>13+ years</w:t>
       </w:r>
       <w:r>
-        <w:t xml:space="preserve"> of prior operations and supply-chain experience, adding mature documentation, coordination, and problem-solving skills to junior systems and network support work.</w:t>
+        <w:t xml:space="preserve"> of operations and supply-chain experience, bringing mature documentation, coordination, and problem-solving skills to junior infrastructure support roles.</w:t>
       </w:r>
     </w:p>
     <w:p>
       <w:pPr>
         <w:pBdr>
-          <w:bottom w:val="single" w:sz="8" w:space="1" w:color="D8E8FF"/>
+          <w:bottom w:val="single" w:sz="8" w:space="1" w:color="D6E3F7"/>
         </w:pBdr>
-        <w:spacing w:before="90" w:after="36" w:line="260" w:lineRule="exact"/>
+        <w:spacing w:before="100" w:after="36" w:line="256" w:lineRule="exact"/>
       </w:pPr>
       <w:r>
         <w:rPr>
@@ -117,68 +103,85 @@
     </w:p>
     <w:p>
       <w:pPr>
-        <w:spacing w:after="6" w:line="250" w:lineRule="exact"/>
+        <w:spacing w:after="4" w:line="254" w:lineRule="exact"/>
       </w:pPr>
       <w:r>
         <w:rPr>
           <w:b/>
         </w:rPr>
-        <w:t>Algonquin College, Ottawa, ON</w:t>
+        <w:t>Algonquin College</w:t>
+      </w:r>
+      <w:r>
+        <w:t>, Ottawa, ON</w:t>
       </w:r>
     </w:p>
     <w:p>
       <w:pPr>
-        <w:spacing w:after="4" w:line="250" w:lineRule="exact"/>
+        <w:spacing w:after="3" w:line="250" w:lineRule="exact"/>
       </w:pPr>
       <w:r>
+        <w:rPr>
+          <w:sz w:val="18"/>
+        </w:rPr>
         <w:t xml:space="preserve">Computer Systems Technician - Networking Diploma, Expected Graduation: </w:t>
       </w:r>
       <w:r>
         <w:rPr>
           <w:b/>
+          <w:sz w:val="18"/>
         </w:rPr>
         <w:t>April 2026</w:t>
       </w:r>
     </w:p>
     <w:p>
       <w:pPr>
-        <w:spacing w:after="13" w:line="250" w:lineRule="exact"/>
+        <w:spacing w:after="11" w:line="248" w:lineRule="exact"/>
+      </w:pPr>
+      <w:r>
+        <w:rPr>
+          <w:b/>
+          <w:sz w:val="18"/>
+        </w:rPr>
+        <w:t>GPA: 3.99/4.0</w:t>
+      </w:r>
+      <w:r>
+        <w:rPr>
+          <w:sz w:val="18"/>
+        </w:rPr>
+        <w:t xml:space="preserve"> | Dean's Honour List (Fall 2024, Winter 2025, Summer 2025)</w:t>
+      </w:r>
+    </w:p>
+    <w:p>
+      <w:pPr>
+        <w:spacing w:after="3" w:line="254" w:lineRule="exact"/>
       </w:pPr>
       <w:r>
         <w:rPr>
           <w:b/>
         </w:rPr>
-        <w:t>GPA: 3.99/4.0</w:t>
+        <w:t>Shanghai Normal University</w:t>
       </w:r>
       <w:r>
-        <w:t xml:space="preserve"> | Dean's Honour List (Fall 2024, Winter 2025, Summer 2025)</w:t>
+        <w:t>, Shanghai, China</w:t>
       </w:r>
     </w:p>
     <w:p>
       <w:pPr>
-        <w:spacing w:after="6" w:line="250" w:lineRule="exact"/>
+        <w:spacing w:after="17" w:line="246" w:lineRule="exact"/>
       </w:pPr>
       <w:r>
         <w:rPr>
-          <w:b/>
+          <w:sz w:val="18"/>
         </w:rPr>
-        <w:t>Shanghai Normal University, Shanghai, China</w:t>
-      </w:r>
-    </w:p>
-    <w:p>
-      <w:pPr>
-        <w:spacing w:after="18" w:line="250" w:lineRule="exact"/>
-      </w:pPr>
-      <w:r>
         <w:t>Bachelor of Communication Engineering</w:t>
       </w:r>
     </w:p>
     <w:p>
       <w:pPr>
         <w:pBdr>
-          <w:bottom w:val="single" w:sz="8" w:space="1" w:color="D8E8FF"/>
+          <w:bottom w:val="single" w:sz="8" w:space="1" w:color="D6E3F7"/>
         </w:pBdr>
-        <w:spacing w:before="90" w:after="36" w:line="260" w:lineRule="exact"/>
+        <w:spacing w:before="100" w:after="36" w:line="256" w:lineRule="exact"/>
       </w:pPr>
       <w:r>
         <w:rPr>
@@ -191,135 +194,168 @@
     </w:p>
     <w:p>
       <w:pPr>
-        <w:spacing w:after="7" w:line="250" w:lineRule="exact"/>
+        <w:spacing w:after="6" w:line="254" w:lineRule="exact"/>
       </w:pPr>
       <w:r>
         <w:rPr>
           <w:b/>
         </w:rPr>
-        <w:t>Enterprise Infrastructure Capstone | Winter 2026</w:t>
+        <w:t>Enterprise Infrastructure Capstone</w:t>
+      </w:r>
+      <w:r>
+        <w:t xml:space="preserve"> | Winter 2026</w:t>
       </w:r>
     </w:p>
     <w:p>
       <w:pPr>
-        <w:pStyle w:val="ListBullet"/>
-        <w:spacing w:after="18"/>
-        <w:ind w:left="302" w:hanging="202"/>
+        <w:spacing w:after="18" w:line="256" w:lineRule="exact"/>
+        <w:ind w:left="317" w:hanging="202"/>
       </w:pPr>
       <w:r>
-        <w:t xml:space="preserve">Collaborated with </w:t>
+        <w:rPr>
+          <w:sz w:val="18"/>
+        </w:rPr>
+        <w:t xml:space="preserve">• Collaborated with </w:t>
       </w:r>
       <w:r>
         <w:rPr>
           <w:b/>
+          <w:sz w:val="18"/>
         </w:rPr>
         <w:t>5 teammates</w:t>
       </w:r>
       <w:r>
+        <w:rPr>
+          <w:sz w:val="18"/>
+        </w:rPr>
         <w:t xml:space="preserve"> to deliver an enterprise infrastructure capstone spanning a simulated private-cloud primary environment, Company 1, Company 2, MSP operations, shared SAN storage, and cross-site protection.</w:t>
       </w:r>
     </w:p>
     <w:p>
       <w:pPr>
-        <w:pStyle w:val="ListBullet"/>
-        <w:spacing w:after="18"/>
-        <w:ind w:left="302" w:hanging="202"/>
+        <w:spacing w:after="18" w:line="256" w:lineRule="exact"/>
+        <w:ind w:left="317" w:hanging="202"/>
       </w:pPr>
       <w:r>
-        <w:t xml:space="preserve">Primary hands-on contribution focused on the simulated private-cloud side on </w:t>
+        <w:rPr>
+          <w:sz w:val="18"/>
+        </w:rPr>
+        <w:t xml:space="preserve">• Primary hands-on contribution focused on the Site 1 private-cloud environment on </w:t>
       </w:r>
       <w:r>
         <w:rPr>
           <w:b/>
+          <w:sz w:val="18"/>
         </w:rPr>
         <w:t>2 HP DL380 servers</w:t>
       </w:r>
       <w:r>
-        <w:t>, with the secondary environment retained as context for MSP access, offsite protection, and recovery workflows.</w:t>
+        <w:rPr>
+          <w:sz w:val="18"/>
+        </w:rPr>
+        <w:t>, with the secondary environment included to support MSP access, offsite protection, and recovery workflows.</w:t>
       </w:r>
     </w:p>
     <w:p>
       <w:pPr>
-        <w:pStyle w:val="ListBullet"/>
-        <w:spacing w:after="18"/>
-        <w:ind w:left="302" w:hanging="202"/>
+        <w:spacing w:after="18" w:line="256" w:lineRule="exact"/>
+        <w:ind w:left="317" w:hanging="202"/>
       </w:pPr>
       <w:r>
-        <w:t xml:space="preserve">Segmented </w:t>
+        <w:rPr>
+          <w:sz w:val="18"/>
+        </w:rPr>
+        <w:t xml:space="preserve">• Segmented </w:t>
       </w:r>
       <w:r>
         <w:rPr>
           <w:b/>
+          <w:sz w:val="18"/>
         </w:rPr>
         <w:t>9 VLANs</w:t>
       </w:r>
       <w:r>
+        <w:rPr>
+          <w:sz w:val="18"/>
+        </w:rPr>
         <w:t xml:space="preserve"> and supported </w:t>
       </w:r>
       <w:r>
         <w:rPr>
           <w:b/>
+          <w:sz w:val="18"/>
         </w:rPr>
         <w:t>12 documented workloads</w:t>
       </w:r>
       <w:r>
+        <w:rPr>
+          <w:sz w:val="18"/>
+        </w:rPr>
         <w:t xml:space="preserve"> across Proxmox VE, OPNsense, Windows Server 2022, Samba AD, Veeam, Grafana, Windows Admin Center, and Cockpit.</w:t>
       </w:r>
     </w:p>
     <w:p>
       <w:pPr>
-        <w:pStyle w:val="ListBullet"/>
-        <w:spacing w:after="18"/>
-        <w:ind w:left="302" w:hanging="202"/>
+        <w:spacing w:after="18" w:line="256" w:lineRule="exact"/>
+        <w:ind w:left="317" w:hanging="202"/>
       </w:pPr>
       <w:r>
+        <w:rPr>
+          <w:sz w:val="18"/>
+        </w:rPr>
+        <w:t xml:space="preserve">• </w:t>
+      </w:r>
+      <w:r>
+        <w:rPr>
+          <w:sz w:val="18"/>
+        </w:rPr>
         <w:t>Implemented tenant-separated identity, DNS, DHCP, DMZ web, file-service, and SAN/iSCSI workflows while preserving approved management paths and bounded security exposure.</w:t>
       </w:r>
     </w:p>
     <w:p>
       <w:pPr>
-        <w:pStyle w:val="ListBullet"/>
-        <w:spacing w:after="18"/>
-        <w:ind w:left="302" w:hanging="202"/>
+        <w:spacing w:after="18" w:line="256" w:lineRule="exact"/>
+        <w:ind w:left="317" w:hanging="202"/>
       </w:pPr>
       <w:r>
-        <w:t xml:space="preserve">Protected </w:t>
+        <w:rPr>
+          <w:sz w:val="18"/>
+        </w:rPr>
+        <w:t xml:space="preserve">• Protected </w:t>
       </w:r>
       <w:r>
         <w:rPr>
           <w:b/>
+          <w:sz w:val="18"/>
         </w:rPr>
         <w:t>10 systems</w:t>
       </w:r>
       <w:r>
+        <w:rPr>
+          <w:sz w:val="18"/>
+        </w:rPr>
         <w:t xml:space="preserve"> and copied </w:t>
       </w:r>
       <w:r>
         <w:rPr>
           <w:b/>
+          <w:sz w:val="18"/>
         </w:rPr>
         <w:t>7 selected backup jobs</w:t>
       </w:r>
       <w:r>
-        <w:t xml:space="preserve"> to the secondary environment over site-to-site OpenVPN; documented the broader MSP access and recovery model in an integrated technical handover.</w:t>
-      </w:r>
-    </w:p>
-    <w:p>
-      <w:pPr>
-        <w:pStyle w:val="ListBullet"/>
-        <w:spacing w:after="18"/>
-        <w:ind w:left="302" w:hanging="202"/>
-      </w:pPr>
-      <w:r>
-        <w:t>Published a portfolio and GitHub project to explain the Site 1 delivery, secondary-environment extension, validation logic, failure-domain thinking, and support documentation for recruiters and hiring teams.</w:t>
+        <w:rPr>
+          <w:sz w:val="18"/>
+        </w:rPr>
+        <w:t xml:space="preserve"> over site-to-site OpenVPN; documented the broader recovery model and published a portfolio/GitHub showcase for recruiters and hiring teams.</w:t>
       </w:r>
     </w:p>
     <w:p>
       <w:pPr>
         <w:pBdr>
-          <w:bottom w:val="single" w:sz="8" w:space="1" w:color="D8E8FF"/>
+          <w:bottom w:val="single" w:sz="8" w:space="1" w:color="D6E3F7"/>
         </w:pBdr>
-        <w:spacing w:before="90" w:after="36" w:line="260" w:lineRule="exact"/>
+        <w:spacing w:before="100" w:after="36" w:line="256" w:lineRule="exact"/>
       </w:pPr>
       <w:r>
         <w:rPr>
@@ -332,52 +368,64 @@
     </w:p>
     <w:p>
       <w:pPr>
-        <w:spacing w:after="4" w:line="250" w:lineRule="exact"/>
+        <w:spacing w:after="3" w:line="247" w:lineRule="exact"/>
       </w:pPr>
       <w:r>
         <w:rPr>
           <w:b/>
+          <w:sz w:val="18"/>
         </w:rPr>
         <w:t>Infrastructure:</w:t>
       </w:r>
       <w:r>
+        <w:rPr>
+          <w:sz w:val="18"/>
+        </w:rPr>
         <w:t xml:space="preserve"> Proxmox VE, Windows Server 2022, Ubuntu, Red Hat/CentOS, Alpine Linux, Windows 10/11</w:t>
       </w:r>
     </w:p>
     <w:p>
       <w:pPr>
-        <w:spacing w:after="4" w:line="250" w:lineRule="exact"/>
+        <w:spacing w:after="3" w:line="247" w:lineRule="exact"/>
       </w:pPr>
       <w:r>
         <w:rPr>
           <w:b/>
+          <w:sz w:val="18"/>
         </w:rPr>
         <w:t>Networking:</w:t>
       </w:r>
       <w:r>
+        <w:rPr>
+          <w:sz w:val="18"/>
+        </w:rPr>
         <w:t xml:space="preserve"> OPNsense/pfSense, Cisco IOS, ArubaOS, VLANs, OSPF, STP, TCP/IP, DNS, DHCP, VPN, NAT, DMZ</w:t>
       </w:r>
     </w:p>
     <w:p>
       <w:pPr>
-        <w:spacing w:after="16" w:line="250" w:lineRule="exact"/>
+        <w:spacing w:after="16" w:line="247" w:lineRule="exact"/>
       </w:pPr>
       <w:r>
         <w:rPr>
           <w:b/>
+          <w:sz w:val="18"/>
         </w:rPr>
         <w:t>Administration &amp; Tools:</w:t>
       </w:r>
       <w:r>
+        <w:rPr>
+          <w:sz w:val="18"/>
+        </w:rPr>
         <w:t xml:space="preserve"> AD DS, GPO, Samba AD, iSCSI, Veeam Backup &amp; Replication, Grafana, InfluxDB, Windows Admin Center, Cockpit, Wireshark, Microsoft 365</w:t>
       </w:r>
     </w:p>
     <w:p>
       <w:pPr>
         <w:pBdr>
-          <w:bottom w:val="single" w:sz="8" w:space="1" w:color="D8E8FF"/>
+          <w:bottom w:val="single" w:sz="8" w:space="1" w:color="D6E3F7"/>
         </w:pBdr>
-        <w:spacing w:before="90" w:after="36" w:line="260" w:lineRule="exact"/>
+        <w:spacing w:before="100" w:after="36" w:line="256" w:lineRule="exact"/>
       </w:pPr>
       <w:r>
         <w:rPr>
@@ -390,123 +438,169 @@
     </w:p>
     <w:p>
       <w:pPr>
-        <w:spacing w:after="6" w:line="250" w:lineRule="exact"/>
+        <w:spacing w:after="4" w:line="252" w:lineRule="exact"/>
       </w:pPr>
       <w:r>
         <w:rPr>
           <w:b/>
+          <w:sz w:val="18"/>
         </w:rPr>
-        <w:t>Senior Business Representative, Winbond Integrated Circuit (Suzhou) Co., Ltd | 2018-2022</w:t>
+        <w:t>Senior Business Representative</w:t>
+      </w:r>
+      <w:r>
+        <w:rPr>
+          <w:sz w:val="18"/>
+        </w:rPr>
+        <w:t>, Winbond Integrated Circuit (Suzhou) Co., Ltd | 2018-2022</w:t>
       </w:r>
     </w:p>
     <w:p>
       <w:pPr>
-        <w:pStyle w:val="ListBullet"/>
-        <w:spacing w:after="18"/>
-        <w:ind w:left="302" w:hanging="202"/>
+        <w:spacing w:after="18" w:line="256" w:lineRule="exact"/>
+        <w:ind w:left="317" w:hanging="202"/>
       </w:pPr>
       <w:r>
-        <w:t xml:space="preserve">Improved on-time delivery by </w:t>
+        <w:rPr>
+          <w:sz w:val="18"/>
+        </w:rPr>
+        <w:t xml:space="preserve">• Improved on-time delivery by </w:t>
       </w:r>
       <w:r>
         <w:rPr>
           <w:b/>
+          <w:sz w:val="18"/>
         </w:rPr>
         <w:t>25%</w:t>
       </w:r>
       <w:r>
+        <w:rPr>
+          <w:sz w:val="18"/>
+        </w:rPr>
         <w:t xml:space="preserve"> by aligning supply planning with customer demand, factory constraints, and R&amp;D priorities across IoT, wearables, and networking product lines.</w:t>
       </w:r>
     </w:p>
     <w:p>
       <w:pPr>
-        <w:pStyle w:val="ListBullet"/>
-        <w:spacing w:after="18"/>
-        <w:ind w:left="302" w:hanging="202"/>
+        <w:spacing w:after="18" w:line="256" w:lineRule="exact"/>
+        <w:ind w:left="317" w:hanging="202"/>
       </w:pPr>
       <w:r>
-        <w:t>Identified new opportunities in IoT, wearables, and networking markets and coordinated cross-functional teams to align roadmap, demand, and customer requirements.</w:t>
+        <w:rPr>
+          <w:sz w:val="18"/>
+        </w:rPr>
+        <w:t>• Identified new opportunities in IoT, wearables, and networking markets and coordinated cross-functional teams to align roadmap, demand, and customer requirements.</w:t>
       </w:r>
     </w:p>
     <w:p>
       <w:pPr>
-        <w:spacing w:after="6" w:line="250" w:lineRule="exact"/>
+        <w:spacing w:after="4" w:line="252" w:lineRule="exact"/>
       </w:pPr>
       <w:r>
         <w:rPr>
           <w:b/>
+          <w:sz w:val="18"/>
         </w:rPr>
-        <w:t>Resource Development Manager, Shanghai Uniscope Electronics Co., Ltd | 2009-2018</w:t>
+        <w:t>Resource Development Manager</w:t>
+      </w:r>
+      <w:r>
+        <w:rPr>
+          <w:sz w:val="18"/>
+        </w:rPr>
+        <w:t>, Shanghai Uniscope Electronics Co., Ltd | 2009-2018</w:t>
       </w:r>
     </w:p>
     <w:p>
       <w:pPr>
-        <w:pStyle w:val="ListBullet"/>
-        <w:spacing w:after="18"/>
-        <w:ind w:left="302" w:hanging="202"/>
+        <w:spacing w:after="18" w:line="256" w:lineRule="exact"/>
+        <w:ind w:left="317" w:hanging="202"/>
       </w:pPr>
       <w:r>
-        <w:t xml:space="preserve">Increased operational efficiency by </w:t>
+        <w:rPr>
+          <w:sz w:val="18"/>
+        </w:rPr>
+        <w:t xml:space="preserve">• Increased operational efficiency by </w:t>
       </w:r>
       <w:r>
         <w:rPr>
           <w:b/>
+          <w:sz w:val="18"/>
         </w:rPr>
         <w:t>20%</w:t>
       </w:r>
       <w:r>
+        <w:rPr>
+          <w:sz w:val="18"/>
+        </w:rPr>
         <w:t xml:space="preserve">, reduced procurement costs by </w:t>
       </w:r>
       <w:r>
         <w:rPr>
           <w:b/>
+          <w:sz w:val="18"/>
         </w:rPr>
         <w:t>5%</w:t>
       </w:r>
       <w:r>
+        <w:rPr>
+          <w:sz w:val="18"/>
+        </w:rPr>
         <w:t xml:space="preserve">, and shortened lead times by </w:t>
       </w:r>
       <w:r>
         <w:rPr>
           <w:b/>
+          <w:sz w:val="18"/>
         </w:rPr>
         <w:t>15%</w:t>
       </w:r>
       <w:r>
+        <w:rPr>
+          <w:sz w:val="18"/>
+        </w:rPr>
         <w:t xml:space="preserve"> by improving supplier management, shortage response, and purchasing workflows.</w:t>
       </w:r>
     </w:p>
     <w:p>
       <w:pPr>
-        <w:pStyle w:val="ListBullet"/>
-        <w:spacing w:after="18"/>
-        <w:ind w:left="302" w:hanging="202"/>
+        <w:spacing w:after="18" w:line="256" w:lineRule="exact"/>
+        <w:ind w:left="317" w:hanging="202"/>
       </w:pPr>
       <w:r>
-        <w:t xml:space="preserve">Reduced supply-chain disruptions by </w:t>
+        <w:rPr>
+          <w:sz w:val="18"/>
+        </w:rPr>
+        <w:t xml:space="preserve">• Reduced supply-chain disruptions by </w:t>
       </w:r>
       <w:r>
         <w:rPr>
           <w:b/>
+          <w:sz w:val="18"/>
         </w:rPr>
         <w:t>8%</w:t>
       </w:r>
       <w:r>
+        <w:rPr>
+          <w:sz w:val="18"/>
+        </w:rPr>
         <w:t xml:space="preserve"> and improved supplier performance by </w:t>
       </w:r>
       <w:r>
         <w:rPr>
           <w:b/>
+          <w:sz w:val="18"/>
         </w:rPr>
         <w:t>10%</w:t>
       </w:r>
       <w:r>
+        <w:rPr>
+          <w:sz w:val="18"/>
+        </w:rPr>
         <w:t xml:space="preserve"> through stronger vendor management, inventory control, and escalation handling.</w:t>
       </w:r>
     </w:p>
     <w:sectPr>
       <w:pgSz w:w="12240" w:h="15840"/>
-      <w:pgMar w:top="619" w:right="720" w:bottom="619" w:left="720" w:header="720" w:footer="720" w:gutter="0"/>
+      <w:pgMar w:top="691" w:right="835" w:bottom="691" w:left="835" w:header="720" w:footer="720" w:gutter="0"/>
       <w:cols w:space="720"/>
       <w:docGrid w:linePitch="360"/>
     </w:sectPr>
@@ -737,31 +831,31 @@
       </w:rPr>
     </w:lvl>
   </w:abstractNum>
-  <w:num w:numId="1" w16cid:durableId="96996300">
+  <w:num w:numId="1" w16cid:durableId="1126658776">
     <w:abstractNumId w:val="8"/>
   </w:num>
-  <w:num w:numId="2" w16cid:durableId="632294402">
+  <w:num w:numId="2" w16cid:durableId="572665697">
     <w:abstractNumId w:val="6"/>
   </w:num>
-  <w:num w:numId="3" w16cid:durableId="1148327655">
+  <w:num w:numId="3" w16cid:durableId="651910836">
     <w:abstractNumId w:val="5"/>
   </w:num>
-  <w:num w:numId="4" w16cid:durableId="888691587">
+  <w:num w:numId="4" w16cid:durableId="1732073265">
     <w:abstractNumId w:val="4"/>
   </w:num>
-  <w:num w:numId="5" w16cid:durableId="1063210501">
+  <w:num w:numId="5" w16cid:durableId="956715804">
     <w:abstractNumId w:val="7"/>
   </w:num>
-  <w:num w:numId="6" w16cid:durableId="1118992673">
+  <w:num w:numId="6" w16cid:durableId="1681741631">
     <w:abstractNumId w:val="3"/>
   </w:num>
-  <w:num w:numId="7" w16cid:durableId="388068111">
+  <w:num w:numId="7" w16cid:durableId="1382023765">
     <w:abstractNumId w:val="2"/>
   </w:num>
-  <w:num w:numId="8" w16cid:durableId="1963001090">
+  <w:num w:numId="8" w16cid:durableId="1073700740">
     <w:abstractNumId w:val="1"/>
   </w:num>
-  <w:num w:numId="9" w16cid:durableId="1489326351">
+  <w:num w:numId="9" w16cid:durableId="610552976">
     <w:abstractNumId w:val="0"/>
   </w:num>
 </w:numbering>
@@ -1158,12 +1252,12 @@
     <w:qFormat/>
     <w:rsid w:val="00FC693F"/>
     <w:pPr>
-      <w:spacing w:after="28" w:line="262" w:lineRule="exact"/>
+      <w:spacing w:after="24" w:line="260" w:lineRule="exact"/>
     </w:pPr>
     <w:rPr>
-      <w:rFonts w:ascii="Segoe UI" w:eastAsia="Segoe UI" w:hAnsi="Segoe UI"/>
-      <w:color w:val="212B36"/>
-      <w:sz w:val="18"/>
+      <w:rFonts w:ascii="Aptos" w:eastAsia="Aptos" w:hAnsi="Aptos"/>
+      <w:color w:val="1F2937"/>
+      <w:sz w:val="19"/>
     </w:rPr>
   </w:style>
   <w:style w:type="paragraph" w:styleId="Heading1">
@@ -1692,7 +1786,6 @@
       <w:numPr>
         <w:numId w:val="1"/>
       </w:numPr>
-      <w:spacing w:after="16" w:line="260" w:lineRule="exact"/>
       <w:contextualSpacing/>
     </w:pPr>
   </w:style>
@@ -1960,6 +2053,7 @@
       <w:b/>
       <w:bCs/>
       <w:color w:val="4F81BD" w:themeColor="accent1"/>
+      <w:sz w:val="18"/>
       <w:szCs w:val="18"/>
     </w:rPr>
   </w:style>

</xml_diff>

<commit_message>
Update formatted IT support resume
</commit_message>
<xml_diff>
--- a/assets/Yiqin_Huang_Resume_One_Page.docx
+++ b/assets/Yiqin_Huang_Resume_One_Page.docx
@@ -4,968 +4,814 @@
   <w:body>
     <w:p>
       <w:pPr>
-        <w:spacing w:before="0" w:after="11" w:line="430" w:lineRule="exact"/>
-        <w:jc w:val="left"/>
+        <w:keepNext w:val="0"/>
+        <w:keepLines w:val="0"/>
+        <w:pageBreakBefore w:val="0"/>
+        <w:widowControl w:val="0"/>
+        <w:spacing w:after="10" w:line="240" w:lineRule="auto"/>
       </w:pPr>
       <w:r>
         <w:rPr>
-          <w:rFonts w:ascii="Aptos Display" w:hAnsi="Aptos Display" w:eastAsia="Aptos Display"/>
+          <w:rFonts w:ascii="Calibri" w:hAnsi="Calibri" w:eastAsia="Calibri"/>
           <w:b/>
-          <w:i w:val="0"/>
-          <w:color w:val="1A73E8"/>
-          <w:sz w:val="40"/>
+          <w:color w:val="2467D6"/>
+          <w:sz w:val="34"/>
         </w:rPr>
         <w:t>Yiqin Huang</w:t>
       </w:r>
     </w:p>
     <w:p>
       <w:pPr>
-        <w:spacing w:before="0" w:after="4" w:line="260" w:lineRule="exact"/>
-        <w:jc w:val="left"/>
+        <w:keepNext w:val="0"/>
+        <w:keepLines w:val="0"/>
+        <w:pageBreakBefore w:val="0"/>
+        <w:widowControl w:val="0"/>
+        <w:spacing w:after="10" w:line="240" w:lineRule="auto"/>
       </w:pPr>
       <w:r>
         <w:rPr>
-          <w:rFonts w:ascii="Aptos" w:hAnsi="Aptos" w:eastAsia="Aptos"/>
+          <w:rFonts w:ascii="Calibri" w:hAnsi="Calibri" w:eastAsia="Calibri"/>
           <w:b/>
-          <w:i w:val="0"/>
-          <w:color w:val="1F2937"/>
-          <w:sz w:val="20"/>
+          <w:color w:val="1F1F1F"/>
+          <w:sz w:val="21"/>
         </w:rPr>
         <w:t>IT Support | Junior Systems / Network Support</w:t>
       </w:r>
     </w:p>
     <w:p>
       <w:pPr>
-        <w:spacing w:before="0" w:after="70" w:line="242" w:lineRule="exact"/>
-        <w:jc w:val="left"/>
+        <w:keepNext w:val="0"/>
+        <w:keepLines w:val="0"/>
+        <w:pageBreakBefore w:val="0"/>
+        <w:widowControl w:val="0"/>
+        <w:spacing w:after="80" w:line="240" w:lineRule="auto"/>
         <w:pBdr>
-          <w:bottom w:val="single" w:sz="10" w:space="2" w:color="C6DAFC"/>
+          <w:bottom w:val="single" w:sz="4" w:space="1" w:color="D9E2F3"/>
         </w:pBdr>
       </w:pPr>
       <w:r>
         <w:rPr>
-          <w:rFonts w:ascii="Aptos" w:hAnsi="Aptos" w:eastAsia="Aptos"/>
+          <w:rFonts w:ascii="Calibri" w:hAnsi="Calibri" w:eastAsia="Calibri"/>
           <w:b w:val="0"/>
-          <w:i w:val="0"/>
-          <w:color w:val="4B5563"/>
-          <w:sz w:val="18"/>
+          <w:color w:val="5F6368"/>
+          <w:sz w:val="17"/>
         </w:rPr>
-        <w:t>Ottawa, ON  |  613-608-9256  |  huangstephen3@gmail.com  |  linkedin.com/in/yiqinhuang2025  |  huangstephen3.github.io</w:t>
+        <w:t>Ottawa, ON | 613-608-9256 | huangstephen3@gmail.com | linkedin.com/in/yiqinhuang2025 | huangstephen3.github.io</w:t>
       </w:r>
     </w:p>
     <w:p>
       <w:pPr>
-        <w:spacing w:before="90" w:after="32" w:line="250" w:lineRule="exact"/>
-        <w:jc w:val="left"/>
+        <w:keepNext w:val="0"/>
+        <w:keepLines w:val="0"/>
+        <w:pageBreakBefore w:val="0"/>
+        <w:widowControl w:val="0"/>
+        <w:spacing w:before="70" w:after="30" w:line="240" w:lineRule="auto"/>
         <w:pBdr>
-          <w:bottom w:val="single" w:sz="8" w:space="1" w:color="D6E3F7"/>
+          <w:bottom w:val="single" w:sz="4" w:space="1" w:color="D9E2F3"/>
         </w:pBdr>
       </w:pPr>
       <w:r>
         <w:rPr>
-          <w:rFonts w:ascii="Aptos" w:hAnsi="Aptos" w:eastAsia="Aptos"/>
+          <w:rFonts w:ascii="Calibri" w:hAnsi="Calibri" w:eastAsia="Calibri"/>
           <w:b/>
-          <w:i w:val="0"/>
-          <w:color w:val="1A73E8"/>
+          <w:color w:val="2467D6"/>
           <w:sz w:val="20"/>
         </w:rPr>
-        <w:t>SUMMARY</w:t>
+        <w:t>Summary</w:t>
       </w:r>
     </w:p>
     <w:p>
       <w:pPr>
-        <w:spacing w:before="0" w:after="26" w:line="254" w:lineRule="exact"/>
+        <w:keepNext w:val="0"/>
+        <w:keepLines w:val="0"/>
+        <w:pageBreakBefore w:val="0"/>
+        <w:widowControl w:val="0"/>
+        <w:spacing w:before="0" w:after="36" w:line="240" w:lineRule="auto"/>
+        <w:ind w:left="0"/>
         <w:jc w:val="left"/>
       </w:pPr>
       <w:r>
         <w:rPr>
-          <w:rFonts w:ascii="Aptos" w:hAnsi="Aptos" w:eastAsia="Aptos"/>
+          <w:rFonts w:ascii="Calibri" w:hAnsi="Calibri" w:eastAsia="Calibri"/>
           <w:b w:val="0"/>
-          <w:i w:val="0"/>
-          <w:color w:val="1F2937"/>
-          <w:sz w:val="18"/>
+          <w:color w:val="1F1F1F"/>
+          <w:sz w:val="20"/>
         </w:rPr>
-        <w:t>Dean's Honour List candidate in Computer Systems Technician - Networking (</w:t>
-      </w:r>
-      <w:r>
-        <w:rPr>
-          <w:rFonts w:ascii="Aptos" w:hAnsi="Aptos" w:eastAsia="Aptos"/>
-          <w:b/>
-          <w:i w:val="0"/>
-          <w:color w:val="1F2937"/>
-          <w:sz w:val="18"/>
-        </w:rPr>
-        <w:t>GPA 3.99/4.0</w:t>
-      </w:r>
-      <w:r>
-        <w:rPr>
-          <w:rFonts w:ascii="Aptos" w:hAnsi="Aptos" w:eastAsia="Aptos"/>
-          <w:b w:val="0"/>
-          <w:i w:val="0"/>
-          <w:color w:val="1F2937"/>
-          <w:sz w:val="18"/>
-        </w:rPr>
-        <w:t xml:space="preserve">) with hands-on experience independently building and supporting Site 1 of an enterprise infrastructure capstone. Strongest in troubleshooting, end-user access validation, support documentation, monitoring, backup verification, and support-ready handover. Combines recent systems/network training with </w:t>
-      </w:r>
-      <w:r>
-        <w:rPr>
-          <w:rFonts w:ascii="Aptos" w:hAnsi="Aptos" w:eastAsia="Aptos"/>
-          <w:b/>
-          <w:i w:val="0"/>
-          <w:color w:val="1F2937"/>
-          <w:sz w:val="18"/>
-        </w:rPr>
-        <w:t>13+ years</w:t>
-      </w:r>
-      <w:r>
-        <w:rPr>
-          <w:rFonts w:ascii="Aptos" w:hAnsi="Aptos" w:eastAsia="Aptos"/>
-          <w:b w:val="0"/>
-          <w:i w:val="0"/>
-          <w:color w:val="1F2937"/>
-          <w:sz w:val="18"/>
-        </w:rPr>
-        <w:t xml:space="preserve"> of experience in high-pressure operations environments, bringing mature communication, coordination, and problem-solving to IT support and junior systems roles.</w:t>
+        <w:t>Dean's Honour List candidate in Computer Systems Technician - Networking (GPA 3.99/4.0) with hands-on experience independently building and supporting Site 1 of an enterprise infrastructure capstone. Strongest in troubleshooting, end-user access validation, support documentation, monitoring, backup verification, and support-ready handover. Combines recent systems/network training with 13+ years of experience in high-pressure operations environments, bringing mature communication, coordination, and problem-solving to IT support and junior systems roles.</w:t>
       </w:r>
     </w:p>
     <w:p>
       <w:pPr>
-        <w:spacing w:before="90" w:after="32" w:line="250" w:lineRule="exact"/>
-        <w:jc w:val="left"/>
+        <w:keepNext w:val="0"/>
+        <w:keepLines w:val="0"/>
+        <w:pageBreakBefore w:val="0"/>
+        <w:widowControl w:val="0"/>
+        <w:spacing w:before="70" w:after="30" w:line="240" w:lineRule="auto"/>
         <w:pBdr>
-          <w:bottom w:val="single" w:sz="8" w:space="1" w:color="D6E3F7"/>
+          <w:bottom w:val="single" w:sz="4" w:space="1" w:color="D9E2F3"/>
         </w:pBdr>
       </w:pPr>
       <w:r>
         <w:rPr>
-          <w:rFonts w:ascii="Aptos" w:hAnsi="Aptos" w:eastAsia="Aptos"/>
+          <w:rFonts w:ascii="Calibri" w:hAnsi="Calibri" w:eastAsia="Calibri"/>
           <w:b/>
-          <w:i w:val="0"/>
-          <w:color w:val="1A73E8"/>
+          <w:color w:val="2467D6"/>
           <w:sz w:val="20"/>
         </w:rPr>
-        <w:t>EDUCATION</w:t>
+        <w:t>Education</w:t>
       </w:r>
     </w:p>
     <w:p>
       <w:pPr>
-        <w:spacing w:before="0" w:after="3" w:line="249" w:lineRule="exact"/>
+        <w:keepNext w:val="0"/>
+        <w:keepLines w:val="0"/>
+        <w:pageBreakBefore w:val="0"/>
+        <w:widowControl w:val="0"/>
+        <w:spacing w:before="0" w:after="4" w:line="240" w:lineRule="auto"/>
+        <w:ind w:left="0"/>
         <w:jc w:val="left"/>
       </w:pPr>
       <w:r>
         <w:rPr>
-          <w:rFonts w:ascii="Aptos" w:hAnsi="Aptos" w:eastAsia="Aptos"/>
+          <w:rFonts w:ascii="Calibri" w:hAnsi="Calibri" w:eastAsia="Calibri"/>
           <w:b/>
-          <w:i w:val="0"/>
-          <w:color w:val="1F2937"/>
-          <w:sz w:val="18"/>
+          <w:color w:val="1F1F1F"/>
+          <w:sz w:val="20"/>
         </w:rPr>
-        <w:t>Algonquin College</w:t>
-      </w:r>
-      <w:r>
-        <w:rPr>
-          <w:rFonts w:ascii="Aptos" w:hAnsi="Aptos" w:eastAsia="Aptos"/>
-          <w:b w:val="0"/>
-          <w:i w:val="0"/>
-          <w:color w:val="1F2937"/>
-          <w:sz w:val="18"/>
-        </w:rPr>
-        <w:t>, Ottawa, ON</w:t>
+        <w:t>Algonquin College, Ottawa, ON</w:t>
       </w:r>
     </w:p>
     <w:p>
       <w:pPr>
-        <w:spacing w:before="0" w:after="2" w:line="244" w:lineRule="exact"/>
+        <w:keepNext w:val="0"/>
+        <w:keepLines w:val="0"/>
+        <w:pageBreakBefore w:val="0"/>
+        <w:widowControl w:val="0"/>
+        <w:spacing w:before="0" w:after="4" w:line="240" w:lineRule="auto"/>
+        <w:ind w:left="0"/>
         <w:jc w:val="left"/>
       </w:pPr>
       <w:r>
         <w:rPr>
-          <w:rFonts w:ascii="Aptos" w:hAnsi="Aptos" w:eastAsia="Aptos"/>
+          <w:rFonts w:ascii="Calibri" w:hAnsi="Calibri" w:eastAsia="Calibri"/>
           <w:b w:val="0"/>
-          <w:i w:val="0"/>
-          <w:color w:val="1F2937"/>
-          <w:sz w:val="18"/>
+          <w:color w:val="1F1F1F"/>
+          <w:sz w:val="20"/>
         </w:rPr>
-        <w:t xml:space="preserve">Computer Systems Technician - Networking Diploma, Expected Graduation: </w:t>
-      </w:r>
-      <w:r>
-        <w:rPr>
-          <w:rFonts w:ascii="Aptos" w:hAnsi="Aptos" w:eastAsia="Aptos"/>
-          <w:b/>
-          <w:i w:val="0"/>
-          <w:color w:val="1F2937"/>
-          <w:sz w:val="18"/>
-        </w:rPr>
-        <w:t>April 2026</w:t>
+        <w:t>Computer Systems Technician - Networking Diploma, Expected Graduation: April 2026</w:t>
       </w:r>
     </w:p>
     <w:p>
       <w:pPr>
-        <w:spacing w:before="0" w:after="10" w:line="241" w:lineRule="exact"/>
+        <w:keepNext w:val="0"/>
+        <w:keepLines w:val="0"/>
+        <w:pageBreakBefore w:val="0"/>
+        <w:widowControl w:val="0"/>
+        <w:spacing w:before="0" w:after="16" w:line="240" w:lineRule="auto"/>
+        <w:ind w:left="0"/>
         <w:jc w:val="left"/>
       </w:pPr>
       <w:r>
         <w:rPr>
-          <w:rFonts w:ascii="Aptos" w:hAnsi="Aptos" w:eastAsia="Aptos"/>
-          <w:b/>
-          <w:i w:val="0"/>
-          <w:color w:val="1F2937"/>
-          <w:sz w:val="18"/>
+          <w:rFonts w:ascii="Calibri" w:hAnsi="Calibri" w:eastAsia="Calibri"/>
+          <w:b w:val="0"/>
+          <w:color w:val="3C4043"/>
+          <w:sz w:val="19"/>
         </w:rPr>
-        <w:t>GPA: 3.99/4.0</w:t>
-      </w:r>
-      <w:r>
-        <w:rPr>
-          <w:rFonts w:ascii="Aptos" w:hAnsi="Aptos" w:eastAsia="Aptos"/>
-          <w:b w:val="0"/>
-          <w:i w:val="0"/>
-          <w:color w:val="1F2937"/>
-          <w:sz w:val="18"/>
-        </w:rPr>
-        <w:t xml:space="preserve"> | Dean's Honour List (Fall 2024, Winter 2025, Summer 2025)</w:t>
+        <w:t>GPA: 3.99/4.0 | Dean's Honour List (Fall 2024, Winter 2025, Summer 2025)</w:t>
       </w:r>
     </w:p>
     <w:p>
       <w:pPr>
-        <w:spacing w:before="0" w:after="2" w:line="249" w:lineRule="exact"/>
+        <w:keepNext w:val="0"/>
+        <w:keepLines w:val="0"/>
+        <w:pageBreakBefore w:val="0"/>
+        <w:widowControl w:val="0"/>
+        <w:spacing w:before="0" w:after="4" w:line="240" w:lineRule="auto"/>
+        <w:ind w:left="0"/>
         <w:jc w:val="left"/>
       </w:pPr>
       <w:r>
         <w:rPr>
-          <w:rFonts w:ascii="Aptos" w:hAnsi="Aptos" w:eastAsia="Aptos"/>
+          <w:rFonts w:ascii="Calibri" w:hAnsi="Calibri" w:eastAsia="Calibri"/>
           <w:b/>
-          <w:i w:val="0"/>
-          <w:color w:val="1F2937"/>
-          <w:sz w:val="18"/>
+          <w:color w:val="1F1F1F"/>
+          <w:sz w:val="20"/>
         </w:rPr>
-        <w:t>Shanghai Normal University</w:t>
-      </w:r>
-      <w:r>
-        <w:rPr>
-          <w:rFonts w:ascii="Aptos" w:hAnsi="Aptos" w:eastAsia="Aptos"/>
-          <w:b w:val="0"/>
-          <w:i w:val="0"/>
-          <w:color w:val="1F2937"/>
-          <w:sz w:val="18"/>
-        </w:rPr>
-        <w:t>, Shanghai, China</w:t>
+        <w:t>Shanghai Normal University, Shanghai, China</w:t>
       </w:r>
     </w:p>
     <w:p>
       <w:pPr>
-        <w:spacing w:before="0" w:after="14" w:line="240" w:lineRule="exact"/>
+        <w:keepNext w:val="0"/>
+        <w:keepLines w:val="0"/>
+        <w:pageBreakBefore w:val="0"/>
+        <w:widowControl w:val="0"/>
+        <w:spacing w:before="0" w:after="24" w:line="240" w:lineRule="auto"/>
+        <w:ind w:left="0"/>
         <w:jc w:val="left"/>
       </w:pPr>
       <w:r>
         <w:rPr>
-          <w:rFonts w:ascii="Aptos" w:hAnsi="Aptos" w:eastAsia="Aptos"/>
+          <w:rFonts w:ascii="Calibri" w:hAnsi="Calibri" w:eastAsia="Calibri"/>
           <w:b w:val="0"/>
-          <w:i w:val="0"/>
-          <w:color w:val="1F2937"/>
-          <w:sz w:val="18"/>
+          <w:color w:val="1F1F1F"/>
+          <w:sz w:val="20"/>
         </w:rPr>
         <w:t>Bachelor of Communication Engineering</w:t>
       </w:r>
     </w:p>
     <w:p>
       <w:pPr>
-        <w:spacing w:before="90" w:after="32" w:line="250" w:lineRule="exact"/>
-        <w:jc w:val="left"/>
+        <w:keepNext w:val="0"/>
+        <w:keepLines w:val="0"/>
+        <w:pageBreakBefore w:val="0"/>
+        <w:widowControl w:val="0"/>
+        <w:spacing w:before="70" w:after="30" w:line="240" w:lineRule="auto"/>
         <w:pBdr>
-          <w:bottom w:val="single" w:sz="8" w:space="1" w:color="D6E3F7"/>
+          <w:bottom w:val="single" w:sz="4" w:space="1" w:color="D9E2F3"/>
         </w:pBdr>
       </w:pPr>
       <w:r>
         <w:rPr>
-          <w:rFonts w:ascii="Aptos" w:hAnsi="Aptos" w:eastAsia="Aptos"/>
+          <w:rFonts w:ascii="Calibri" w:hAnsi="Calibri" w:eastAsia="Calibri"/>
           <w:b/>
-          <w:i w:val="0"/>
-          <w:color w:val="1A73E8"/>
+          <w:color w:val="2467D6"/>
           <w:sz w:val="20"/>
         </w:rPr>
-        <w:t>TECHNICAL PROJECTS</w:t>
+        <w:t>Technical Projects</w:t>
       </w:r>
     </w:p>
     <w:p>
       <w:pPr>
-        <w:spacing w:before="0" w:after="5" w:line="249" w:lineRule="exact"/>
+        <w:keepNext w:val="0"/>
+        <w:keepLines w:val="0"/>
+        <w:pageBreakBefore w:val="0"/>
+        <w:widowControl w:val="0"/>
+        <w:spacing w:before="0" w:after="16" w:line="240" w:lineRule="auto"/>
+        <w:ind w:left="0"/>
         <w:jc w:val="left"/>
       </w:pPr>
       <w:r>
         <w:rPr>
-          <w:rFonts w:ascii="Aptos" w:hAnsi="Aptos" w:eastAsia="Aptos"/>
+          <w:rFonts w:ascii="Calibri" w:hAnsi="Calibri" w:eastAsia="Calibri"/>
           <w:b/>
-          <w:i w:val="0"/>
-          <w:color w:val="1F2937"/>
-          <w:sz w:val="18"/>
+          <w:color w:val="1F1F1F"/>
+          <w:sz w:val="20"/>
         </w:rPr>
-        <w:t>Enterprise Infrastructure Capstone</w:t>
-      </w:r>
-      <w:r>
-        <w:rPr>
-          <w:rFonts w:ascii="Aptos" w:hAnsi="Aptos" w:eastAsia="Aptos"/>
-          <w:b w:val="0"/>
-          <w:i w:val="0"/>
-          <w:color w:val="1F2937"/>
-          <w:sz w:val="18"/>
-        </w:rPr>
-        <w:t xml:space="preserve"> | Winter 2026</w:t>
+        <w:t>Enterprise Infrastructure Capstone | Winter 2026</w:t>
       </w:r>
     </w:p>
     <w:p>
       <w:pPr>
-        <w:spacing w:after="15" w:line="251" w:lineRule="exact"/>
-        <w:ind w:left="317" w:hanging="202"/>
-        <w:jc w:val="left"/>
+        <w:keepNext w:val="0"/>
+        <w:keepLines w:val="0"/>
+        <w:pageBreakBefore w:val="0"/>
+        <w:widowControl w:val="0"/>
+        <w:spacing w:before="0" w:after="16" w:line="240" w:lineRule="auto"/>
+        <w:ind w:left="230" w:hanging="187"/>
       </w:pPr>
       <w:r>
         <w:rPr>
-          <w:rFonts w:ascii="Aptos" w:hAnsi="Aptos" w:eastAsia="Aptos"/>
+          <w:rFonts w:ascii="Calibri" w:hAnsi="Calibri" w:eastAsia="Calibri"/>
           <w:b w:val="0"/>
-          <w:i w:val="0"/>
-          <w:color w:val="1F2937"/>
-          <w:sz w:val="18"/>
+          <w:color w:val="1F1F1F"/>
+          <w:sz w:val="20"/>
         </w:rPr>
         <w:t xml:space="preserve">• </w:t>
       </w:r>
       <w:r>
         <w:rPr>
-          <w:rFonts w:ascii="Aptos" w:hAnsi="Aptos" w:eastAsia="Aptos"/>
+          <w:rFonts w:ascii="Calibri" w:hAnsi="Calibri" w:eastAsia="Calibri"/>
           <w:b w:val="0"/>
-          <w:i w:val="0"/>
-          <w:color w:val="1F2937"/>
-          <w:sz w:val="18"/>
+          <w:color w:val="1F1F1F"/>
+          <w:sz w:val="20"/>
         </w:rPr>
-        <w:t xml:space="preserve">Independently designed, implemented, and documented </w:t>
-      </w:r>
-      <w:r>
-        <w:rPr>
-          <w:rFonts w:ascii="Aptos" w:hAnsi="Aptos" w:eastAsia="Aptos"/>
-          <w:b/>
-          <w:i w:val="0"/>
-          <w:color w:val="1F2937"/>
-          <w:sz w:val="18"/>
-        </w:rPr>
-        <w:t>Site 1</w:t>
-      </w:r>
-      <w:r>
-        <w:rPr>
-          <w:rFonts w:ascii="Aptos" w:hAnsi="Aptos" w:eastAsia="Aptos"/>
-          <w:b w:val="0"/>
-          <w:i w:val="0"/>
-          <w:color w:val="1F2937"/>
-          <w:sz w:val="18"/>
-        </w:rPr>
-        <w:t xml:space="preserve"> of a multi-tenant enterprise infrastructure capstone on </w:t>
-      </w:r>
-      <w:r>
-        <w:rPr>
-          <w:rFonts w:ascii="Aptos" w:hAnsi="Aptos" w:eastAsia="Aptos"/>
-          <w:b/>
-          <w:i w:val="0"/>
-          <w:color w:val="1F2937"/>
-          <w:sz w:val="18"/>
-        </w:rPr>
-        <w:t>2 HP DL380 servers</w:t>
-      </w:r>
-      <w:r>
-        <w:rPr>
-          <w:rFonts w:ascii="Aptos" w:hAnsi="Aptos" w:eastAsia="Aptos"/>
-          <w:b w:val="0"/>
-          <w:i w:val="0"/>
-          <w:color w:val="1F2937"/>
-          <w:sz w:val="18"/>
-        </w:rPr>
-        <w:t>, delivering the private-cloud environment within a broader team project.</w:t>
+        <w:t>Independently designed, implemented, and documented Site 1 of a multi-tenant enterprise infrastructure capstone on 2 HP DL380 servers, delivering the private-cloud environment within a broader team project.</w:t>
       </w:r>
     </w:p>
     <w:p>
       <w:pPr>
-        <w:spacing w:after="15" w:line="251" w:lineRule="exact"/>
-        <w:ind w:left="317" w:hanging="202"/>
-        <w:jc w:val="left"/>
+        <w:keepNext w:val="0"/>
+        <w:keepLines w:val="0"/>
+        <w:pageBreakBefore w:val="0"/>
+        <w:widowControl w:val="0"/>
+        <w:spacing w:before="0" w:after="16" w:line="240" w:lineRule="auto"/>
+        <w:ind w:left="230" w:hanging="187"/>
       </w:pPr>
       <w:r>
         <w:rPr>
-          <w:rFonts w:ascii="Aptos" w:hAnsi="Aptos" w:eastAsia="Aptos"/>
+          <w:rFonts w:ascii="Calibri" w:hAnsi="Calibri" w:eastAsia="Calibri"/>
           <w:b w:val="0"/>
-          <w:i w:val="0"/>
-          <w:color w:val="1F2937"/>
-          <w:sz w:val="18"/>
+          <w:color w:val="1F1F1F"/>
+          <w:sz w:val="20"/>
         </w:rPr>
         <w:t xml:space="preserve">• </w:t>
       </w:r>
       <w:r>
         <w:rPr>
-          <w:rFonts w:ascii="Aptos" w:hAnsi="Aptos" w:eastAsia="Aptos"/>
+          <w:rFonts w:ascii="Calibri" w:hAnsi="Calibri" w:eastAsia="Calibri"/>
           <w:b w:val="0"/>
-          <w:i w:val="0"/>
-          <w:color w:val="1F2937"/>
-          <w:sz w:val="18"/>
+          <w:color w:val="1F1F1F"/>
+          <w:sz w:val="20"/>
         </w:rPr>
-        <w:t xml:space="preserve">Built and supported core services across Proxmox VE, OPNsense, Windows Server 2022, Samba AD, Veeam, Grafana, Windows Admin Center, and Cockpit; segmented </w:t>
-      </w:r>
-      <w:r>
-        <w:rPr>
-          <w:rFonts w:ascii="Aptos" w:hAnsi="Aptos" w:eastAsia="Aptos"/>
-          <w:b/>
-          <w:i w:val="0"/>
-          <w:color w:val="1F2937"/>
-          <w:sz w:val="18"/>
-        </w:rPr>
-        <w:t>9 VLANs</w:t>
-      </w:r>
-      <w:r>
-        <w:rPr>
-          <w:rFonts w:ascii="Aptos" w:hAnsi="Aptos" w:eastAsia="Aptos"/>
-          <w:b w:val="0"/>
-          <w:i w:val="0"/>
-          <w:color w:val="1F2937"/>
-          <w:sz w:val="18"/>
-        </w:rPr>
-        <w:t xml:space="preserve"> and maintained </w:t>
-      </w:r>
-      <w:r>
-        <w:rPr>
-          <w:rFonts w:ascii="Aptos" w:hAnsi="Aptos" w:eastAsia="Aptos"/>
-          <w:b/>
-          <w:i w:val="0"/>
-          <w:color w:val="1F2937"/>
-          <w:sz w:val="18"/>
-        </w:rPr>
-        <w:t>12 documented workloads</w:t>
-      </w:r>
-      <w:r>
-        <w:rPr>
-          <w:rFonts w:ascii="Aptos" w:hAnsi="Aptos" w:eastAsia="Aptos"/>
-          <w:b w:val="0"/>
-          <w:i w:val="0"/>
-          <w:color w:val="1F2937"/>
-          <w:sz w:val="18"/>
-        </w:rPr>
-        <w:t>.</w:t>
+        <w:t>Built and supported core services across Proxmox VE, OPNsense, Windows Server 2022, Samba AD, Veeam, Grafana, Windows Admin Center, and Cockpit; segmented 9 VLANs and maintained 12 documented workloads.</w:t>
       </w:r>
     </w:p>
     <w:p>
       <w:pPr>
-        <w:spacing w:after="15" w:line="251" w:lineRule="exact"/>
-        <w:ind w:left="317" w:hanging="202"/>
-        <w:jc w:val="left"/>
+        <w:keepNext w:val="0"/>
+        <w:keepLines w:val="0"/>
+        <w:pageBreakBefore w:val="0"/>
+        <w:widowControl w:val="0"/>
+        <w:spacing w:before="0" w:after="16" w:line="240" w:lineRule="auto"/>
+        <w:ind w:left="230" w:hanging="187"/>
       </w:pPr>
       <w:r>
         <w:rPr>
-          <w:rFonts w:ascii="Aptos" w:hAnsi="Aptos" w:eastAsia="Aptos"/>
+          <w:rFonts w:ascii="Calibri" w:hAnsi="Calibri" w:eastAsia="Calibri"/>
           <w:b w:val="0"/>
-          <w:i w:val="0"/>
-          <w:color w:val="1F2937"/>
-          <w:sz w:val="18"/>
+          <w:color w:val="1F1F1F"/>
+          <w:sz w:val="20"/>
         </w:rPr>
         <w:t xml:space="preserve">• </w:t>
       </w:r>
       <w:r>
         <w:rPr>
-          <w:rFonts w:ascii="Aptos" w:hAnsi="Aptos" w:eastAsia="Aptos"/>
+          <w:rFonts w:ascii="Calibri" w:hAnsi="Calibri" w:eastAsia="Calibri"/>
           <w:b w:val="0"/>
-          <w:i w:val="0"/>
-          <w:color w:val="1F2937"/>
-          <w:sz w:val="18"/>
+          <w:color w:val="1F1F1F"/>
+          <w:sz w:val="20"/>
         </w:rPr>
         <w:t>Created Windows and Linux templates plus tenant-specific identity, DNS, DHCP, DMZ, file-service, and SAN/iSCSI workflows to support repeatable provisioning and stable day-to-day administration.</w:t>
       </w:r>
     </w:p>
     <w:p>
       <w:pPr>
-        <w:spacing w:after="15" w:line="251" w:lineRule="exact"/>
-        <w:ind w:left="317" w:hanging="202"/>
-        <w:jc w:val="left"/>
+        <w:keepNext w:val="0"/>
+        <w:keepLines w:val="0"/>
+        <w:pageBreakBefore w:val="0"/>
+        <w:widowControl w:val="0"/>
+        <w:spacing w:before="0" w:after="16" w:line="240" w:lineRule="auto"/>
+        <w:ind w:left="230" w:hanging="187"/>
       </w:pPr>
       <w:r>
         <w:rPr>
-          <w:rFonts w:ascii="Aptos" w:hAnsi="Aptos" w:eastAsia="Aptos"/>
+          <w:rFonts w:ascii="Calibri" w:hAnsi="Calibri" w:eastAsia="Calibri"/>
           <w:b w:val="0"/>
-          <w:i w:val="0"/>
-          <w:color w:val="1F2937"/>
-          <w:sz w:val="18"/>
+          <w:color w:val="1F1F1F"/>
+          <w:sz w:val="20"/>
         </w:rPr>
         <w:t xml:space="preserve">• </w:t>
       </w:r>
       <w:r>
         <w:rPr>
-          <w:rFonts w:ascii="Aptos" w:hAnsi="Aptos" w:eastAsia="Aptos"/>
+          <w:rFonts w:ascii="Calibri" w:hAnsi="Calibri" w:eastAsia="Calibri"/>
           <w:b w:val="0"/>
-          <w:i w:val="0"/>
-          <w:color w:val="1F2937"/>
-          <w:sz w:val="18"/>
+          <w:color w:val="1F1F1F"/>
+          <w:sz w:val="20"/>
         </w:rPr>
         <w:t>Validated end-user and admin workflows including domain logins, DNS/DHCP resolution, internal web access, mapped shares, per-user private/public permissions, and iSCSI-connected storage from Windows and Linux clients.</w:t>
       </w:r>
     </w:p>
     <w:p>
       <w:pPr>
-        <w:spacing w:after="15" w:line="251" w:lineRule="exact"/>
-        <w:ind w:left="317" w:hanging="202"/>
-        <w:jc w:val="left"/>
+        <w:keepNext w:val="0"/>
+        <w:keepLines w:val="0"/>
+        <w:pageBreakBefore w:val="0"/>
+        <w:widowControl w:val="0"/>
+        <w:spacing w:before="0" w:after="16" w:line="240" w:lineRule="auto"/>
+        <w:ind w:left="230" w:hanging="187"/>
       </w:pPr>
       <w:r>
         <w:rPr>
-          <w:rFonts w:ascii="Aptos" w:hAnsi="Aptos" w:eastAsia="Aptos"/>
+          <w:rFonts w:ascii="Calibri" w:hAnsi="Calibri" w:eastAsia="Calibri"/>
           <w:b w:val="0"/>
-          <w:i w:val="0"/>
-          <w:color w:val="1F2937"/>
-          <w:sz w:val="18"/>
+          <w:color w:val="1F1F1F"/>
+          <w:sz w:val="20"/>
         </w:rPr>
         <w:t xml:space="preserve">• </w:t>
       </w:r>
       <w:r>
         <w:rPr>
-          <w:rFonts w:ascii="Aptos" w:hAnsi="Aptos" w:eastAsia="Aptos"/>
+          <w:rFonts w:ascii="Calibri" w:hAnsi="Calibri" w:eastAsia="Calibri"/>
           <w:b w:val="0"/>
-          <w:i w:val="0"/>
-          <w:color w:val="1F2937"/>
-          <w:sz w:val="18"/>
+          <w:color w:val="1F1F1F"/>
+          <w:sz w:val="20"/>
         </w:rPr>
-        <w:t xml:space="preserve">Protected </w:t>
-      </w:r>
-      <w:r>
-        <w:rPr>
-          <w:rFonts w:ascii="Aptos" w:hAnsi="Aptos" w:eastAsia="Aptos"/>
-          <w:b/>
-          <w:i w:val="0"/>
-          <w:color w:val="1F2937"/>
-          <w:sz w:val="18"/>
-        </w:rPr>
-        <w:t>10 systems</w:t>
-      </w:r>
-      <w:r>
-        <w:rPr>
-          <w:rFonts w:ascii="Aptos" w:hAnsi="Aptos" w:eastAsia="Aptos"/>
-          <w:b w:val="0"/>
-          <w:i w:val="0"/>
-          <w:color w:val="1F2937"/>
-          <w:sz w:val="18"/>
-        </w:rPr>
-        <w:t xml:space="preserve"> and copied </w:t>
-      </w:r>
-      <w:r>
-        <w:rPr>
-          <w:rFonts w:ascii="Aptos" w:hAnsi="Aptos" w:eastAsia="Aptos"/>
-          <w:b/>
-          <w:i w:val="0"/>
-          <w:color w:val="1F2937"/>
-          <w:sz w:val="18"/>
-        </w:rPr>
-        <w:t>7 selected backup jobs</w:t>
-      </w:r>
-      <w:r>
-        <w:rPr>
-          <w:rFonts w:ascii="Aptos" w:hAnsi="Aptos" w:eastAsia="Aptos"/>
-          <w:b w:val="0"/>
-          <w:i w:val="0"/>
-          <w:color w:val="1F2937"/>
-          <w:sz w:val="18"/>
-        </w:rPr>
-        <w:t xml:space="preserve"> over site-to-site OpenVPN; produced handover, daily/weekly/post-change checks, and fast-triage guidance covering authentication, routing, storage access, and backup status.</w:t>
+        <w:t>Protected 10 systems and copied 7 selected backup jobs over site-to-site OpenVPN; produced handover, daily/weekly/post-change checks, and fast-triage guidance covering authentication, routing, storage access, and backup status.</w:t>
       </w:r>
     </w:p>
     <w:p>
       <w:pPr>
-        <w:spacing w:before="90" w:after="32" w:line="250" w:lineRule="exact"/>
-        <w:jc w:val="left"/>
+        <w:keepNext w:val="0"/>
+        <w:keepLines w:val="0"/>
+        <w:pageBreakBefore w:val="0"/>
+        <w:widowControl w:val="0"/>
+        <w:spacing w:before="70" w:after="30" w:line="240" w:lineRule="auto"/>
         <w:pBdr>
-          <w:bottom w:val="single" w:sz="8" w:space="1" w:color="D6E3F7"/>
+          <w:bottom w:val="single" w:sz="4" w:space="1" w:color="D9E2F3"/>
         </w:pBdr>
       </w:pPr>
       <w:r>
         <w:rPr>
-          <w:rFonts w:ascii="Aptos" w:hAnsi="Aptos" w:eastAsia="Aptos"/>
+          <w:rFonts w:ascii="Calibri" w:hAnsi="Calibri" w:eastAsia="Calibri"/>
           <w:b/>
-          <w:i w:val="0"/>
-          <w:color w:val="1A73E8"/>
+          <w:color w:val="2467D6"/>
           <w:sz w:val="20"/>
         </w:rPr>
-        <w:t>TECHNICAL SKILLS</w:t>
+        <w:t>Technical Skills</w:t>
       </w:r>
     </w:p>
     <w:p>
       <w:pPr>
-        <w:spacing w:before="0" w:after="2" w:line="243" w:lineRule="exact"/>
+        <w:keepNext w:val="0"/>
+        <w:keepLines w:val="0"/>
+        <w:pageBreakBefore w:val="0"/>
+        <w:widowControl w:val="0"/>
+        <w:spacing w:after="16" w:line="240" w:lineRule="auto"/>
+      </w:pPr>
+      <w:r>
+        <w:rPr>
+          <w:rFonts w:ascii="Calibri" w:hAnsi="Calibri" w:eastAsia="Calibri"/>
+          <w:b/>
+          <w:color w:val="1F1F1F"/>
+          <w:sz w:val="19"/>
+        </w:rPr>
+        <w:t xml:space="preserve">Infrastructure: </w:t>
+      </w:r>
+      <w:r>
+        <w:rPr>
+          <w:rFonts w:ascii="Calibri" w:hAnsi="Calibri" w:eastAsia="Calibri"/>
+          <w:b w:val="0"/>
+          <w:color w:val="1F1F1F"/>
+          <w:sz w:val="19"/>
+        </w:rPr>
+        <w:t>Proxmox VE, Windows Server 2022, Ubuntu, Red Hat/CentOS, Alpine Linux, Windows 10/11</w:t>
+      </w:r>
+    </w:p>
+    <w:p>
+      <w:pPr>
+        <w:keepNext w:val="0"/>
+        <w:keepLines w:val="0"/>
+        <w:pageBreakBefore w:val="0"/>
+        <w:widowControl w:val="0"/>
+        <w:spacing w:after="16" w:line="240" w:lineRule="auto"/>
+      </w:pPr>
+      <w:r>
+        <w:rPr>
+          <w:rFonts w:ascii="Calibri" w:hAnsi="Calibri" w:eastAsia="Calibri"/>
+          <w:b/>
+          <w:color w:val="1F1F1F"/>
+          <w:sz w:val="19"/>
+        </w:rPr>
+        <w:t xml:space="preserve">Networking: </w:t>
+      </w:r>
+      <w:r>
+        <w:rPr>
+          <w:rFonts w:ascii="Calibri" w:hAnsi="Calibri" w:eastAsia="Calibri"/>
+          <w:b w:val="0"/>
+          <w:color w:val="1F1F1F"/>
+          <w:sz w:val="19"/>
+        </w:rPr>
+        <w:t>OPNsense/pfSense, Cisco IOS, ArubaOS, VLANs, OSPF, STP, TCP/IP, DNS, DHCP, VPN, NAT, DMZ</w:t>
+      </w:r>
+    </w:p>
+    <w:p>
+      <w:pPr>
+        <w:keepNext w:val="0"/>
+        <w:keepLines w:val="0"/>
+        <w:pageBreakBefore w:val="0"/>
+        <w:widowControl w:val="0"/>
+        <w:spacing w:after="16" w:line="240" w:lineRule="auto"/>
+      </w:pPr>
+      <w:r>
+        <w:rPr>
+          <w:rFonts w:ascii="Calibri" w:hAnsi="Calibri" w:eastAsia="Calibri"/>
+          <w:b/>
+          <w:color w:val="1F1F1F"/>
+          <w:sz w:val="19"/>
+        </w:rPr>
+        <w:t xml:space="preserve">Support &amp; Administration: </w:t>
+      </w:r>
+      <w:r>
+        <w:rPr>
+          <w:rFonts w:ascii="Calibri" w:hAnsi="Calibri" w:eastAsia="Calibri"/>
+          <w:b w:val="0"/>
+          <w:color w:val="1F1F1F"/>
+          <w:sz w:val="19"/>
+        </w:rPr>
+        <w:t>AD DS, GPO, Samba AD, PowerShell, iSCSI, Veeam Backup &amp; Replication, Grafana, InfluxDB, Windows Admin Center, Cockpit, Wireshark, Microsoft 365</w:t>
+      </w:r>
+    </w:p>
+    <w:p>
+      <w:pPr>
+        <w:keepNext w:val="0"/>
+        <w:keepLines w:val="0"/>
+        <w:pageBreakBefore w:val="0"/>
+        <w:widowControl w:val="0"/>
+        <w:spacing w:before="70" w:after="30" w:line="240" w:lineRule="auto"/>
+        <w:pBdr>
+          <w:bottom w:val="single" w:sz="4" w:space="1" w:color="D9E2F3"/>
+        </w:pBdr>
+      </w:pPr>
+      <w:r>
+        <w:rPr>
+          <w:rFonts w:ascii="Calibri" w:hAnsi="Calibri" w:eastAsia="Calibri"/>
+          <w:b/>
+          <w:color w:val="2467D6"/>
+          <w:sz w:val="20"/>
+        </w:rPr>
+        <w:t>Additional Experience</w:t>
+      </w:r>
+    </w:p>
+    <w:p>
+      <w:pPr>
+        <w:keepNext w:val="0"/>
+        <w:keepLines w:val="0"/>
+        <w:pageBreakBefore w:val="0"/>
+        <w:widowControl w:val="0"/>
+        <w:spacing w:before="0" w:after="10" w:line="240" w:lineRule="auto"/>
+        <w:ind w:left="0"/>
         <w:jc w:val="left"/>
       </w:pPr>
       <w:r>
         <w:rPr>
-          <w:rFonts w:ascii="Aptos" w:hAnsi="Aptos" w:eastAsia="Aptos"/>
+          <w:rFonts w:ascii="Calibri" w:hAnsi="Calibri" w:eastAsia="Calibri"/>
           <w:b/>
-          <w:i w:val="0"/>
-          <w:color w:val="1F2937"/>
-          <w:sz w:val="18"/>
+          <w:color w:val="1F1F1F"/>
+          <w:sz w:val="20"/>
         </w:rPr>
-        <w:t>Infrastructure:</w:t>
-      </w:r>
-      <w:r>
-        <w:rPr>
-          <w:rFonts w:ascii="Aptos" w:hAnsi="Aptos" w:eastAsia="Aptos"/>
-          <w:b w:val="0"/>
-          <w:i w:val="0"/>
-          <w:color w:val="1F2937"/>
-          <w:sz w:val="18"/>
-        </w:rPr>
-        <w:t xml:space="preserve"> Proxmox VE, Windows Server 2022, Ubuntu, Red Hat/CentOS, Alpine Linux, Windows 10/11</w:t>
+        <w:t>Senior Procurement Engineer, Le-AutomatiX (Bosch Rexroth-affiliated automation business), Shanghai, China | 2023 - 2024</w:t>
       </w:r>
     </w:p>
     <w:p>
       <w:pPr>
-        <w:spacing w:before="0" w:after="2" w:line="243" w:lineRule="exact"/>
-        <w:jc w:val="left"/>
+        <w:keepNext w:val="0"/>
+        <w:keepLines w:val="0"/>
+        <w:pageBreakBefore w:val="0"/>
+        <w:widowControl w:val="0"/>
+        <w:spacing w:before="0" w:after="16" w:line="240" w:lineRule="auto"/>
+        <w:ind w:left="230" w:hanging="187"/>
       </w:pPr>
       <w:r>
         <w:rPr>
-          <w:rFonts w:ascii="Aptos" w:hAnsi="Aptos" w:eastAsia="Aptos"/>
-          <w:b/>
-          <w:i w:val="0"/>
-          <w:color w:val="1F2937"/>
-          <w:sz w:val="18"/>
-        </w:rPr>
-        <w:t>Networking:</w:t>
-      </w:r>
-      <w:r>
-        <w:rPr>
-          <w:rFonts w:ascii="Aptos" w:hAnsi="Aptos" w:eastAsia="Aptos"/>
+          <w:rFonts w:ascii="Calibri" w:hAnsi="Calibri" w:eastAsia="Calibri"/>
           <w:b w:val="0"/>
-          <w:i w:val="0"/>
-          <w:color w:val="1F2937"/>
-          <w:sz w:val="18"/>
-        </w:rPr>
-        <w:t xml:space="preserve"> OPNsense/pfSense, Cisco IOS, ArubaOS, VLANs, OSPF, STP, TCP/IP, DNS, DHCP, VPN, NAT, DMZ</w:t>
-      </w:r>
-    </w:p>
-    <w:p>
-      <w:pPr>
-        <w:spacing w:before="0" w:after="12" w:line="243" w:lineRule="exact"/>
-        <w:jc w:val="left"/>
-      </w:pPr>
-      <w:r>
-        <w:rPr>
-          <w:rFonts w:ascii="Aptos" w:hAnsi="Aptos" w:eastAsia="Aptos"/>
-          <w:b/>
-          <w:i w:val="0"/>
-          <w:color w:val="1F2937"/>
-          <w:sz w:val="18"/>
-        </w:rPr>
-        <w:t>Support &amp; Administration:</w:t>
-      </w:r>
-      <w:r>
-        <w:rPr>
-          <w:rFonts w:ascii="Aptos" w:hAnsi="Aptos" w:eastAsia="Aptos"/>
-          <w:b w:val="0"/>
-          <w:i w:val="0"/>
-          <w:color w:val="1F2937"/>
-          <w:sz w:val="18"/>
-        </w:rPr>
-        <w:t xml:space="preserve"> AD DS, GPO, Samba AD, PowerShell, iSCSI, Veeam Backup &amp; Replication, Grafana, InfluxDB, Windows Admin Center, Cockpit, Wireshark, Microsoft 365</w:t>
-      </w:r>
-    </w:p>
-    <w:p>
-      <w:pPr>
-        <w:spacing w:before="90" w:after="32" w:line="250" w:lineRule="exact"/>
-        <w:jc w:val="left"/>
-        <w:pBdr>
-          <w:bottom w:val="single" w:sz="8" w:space="1" w:color="D6E3F7"/>
-        </w:pBdr>
-      </w:pPr>
-      <w:r>
-        <w:rPr>
-          <w:rFonts w:ascii="Aptos" w:hAnsi="Aptos" w:eastAsia="Aptos"/>
-          <w:b/>
-          <w:i w:val="0"/>
-          <w:color w:val="1A73E8"/>
+          <w:color w:val="1F1F1F"/>
           <w:sz w:val="20"/>
-        </w:rPr>
-        <w:t>ADDITIONAL EXPERIENCE</w:t>
-      </w:r>
-    </w:p>
-    <w:p>
-      <w:pPr>
-        <w:spacing w:before="0" w:after="3" w:line="247" w:lineRule="exact"/>
-        <w:jc w:val="left"/>
-      </w:pPr>
-      <w:r>
-        <w:rPr>
-          <w:rFonts w:ascii="Aptos" w:hAnsi="Aptos" w:eastAsia="Aptos"/>
-          <w:b/>
-          <w:i w:val="0"/>
-          <w:color w:val="1F2937"/>
-          <w:sz w:val="18"/>
-        </w:rPr>
-        <w:t>Senior Business Representative</w:t>
-      </w:r>
-      <w:r>
-        <w:rPr>
-          <w:rFonts w:ascii="Aptos" w:hAnsi="Aptos" w:eastAsia="Aptos"/>
-          <w:b w:val="0"/>
-          <w:i w:val="0"/>
-          <w:color w:val="1F2937"/>
-          <w:sz w:val="18"/>
-        </w:rPr>
-        <w:t>, Winbond Integrated Circuit (Suzhou) Co., Ltd | 2018-2022</w:t>
-      </w:r>
-    </w:p>
-    <w:p>
-      <w:pPr>
-        <w:spacing w:after="15" w:line="251" w:lineRule="exact"/>
-        <w:ind w:left="317" w:hanging="202"/>
-        <w:jc w:val="left"/>
-      </w:pPr>
-      <w:r>
-        <w:rPr>
-          <w:rFonts w:ascii="Aptos" w:hAnsi="Aptos" w:eastAsia="Aptos"/>
-          <w:b w:val="0"/>
-          <w:i w:val="0"/>
-          <w:color w:val="1F2937"/>
-          <w:sz w:val="18"/>
         </w:rPr>
         <w:t xml:space="preserve">• </w:t>
       </w:r>
       <w:r>
         <w:rPr>
-          <w:rFonts w:ascii="Aptos" w:hAnsi="Aptos" w:eastAsia="Aptos"/>
+          <w:rFonts w:ascii="Calibri" w:hAnsi="Calibri" w:eastAsia="Calibri"/>
           <w:b w:val="0"/>
-          <w:i w:val="0"/>
-          <w:color w:val="1F2937"/>
-          <w:sz w:val="18"/>
+          <w:color w:val="1F1F1F"/>
+          <w:sz w:val="20"/>
         </w:rPr>
-        <w:t xml:space="preserve">Improved on-time delivery by </w:t>
-      </w:r>
-      <w:r>
-        <w:rPr>
-          <w:rFonts w:ascii="Aptos" w:hAnsi="Aptos" w:eastAsia="Aptos"/>
-          <w:b/>
-          <w:i w:val="0"/>
-          <w:color w:val="1F2937"/>
-          <w:sz w:val="18"/>
-        </w:rPr>
-        <w:t>25%</w:t>
-      </w:r>
-      <w:r>
-        <w:rPr>
-          <w:rFonts w:ascii="Aptos" w:hAnsi="Aptos" w:eastAsia="Aptos"/>
-          <w:b w:val="0"/>
-          <w:i w:val="0"/>
-          <w:color w:val="1F2937"/>
-          <w:sz w:val="18"/>
-        </w:rPr>
-        <w:t xml:space="preserve"> by aligning supply planning with customer demand, factory constraints, and R&amp;D priorities across IoT, wearables, and networking product lines.</w:t>
+        <w:t>Built and managed procurement operations for a newly established automation business, owning supplier qualification, sourcing, purchasing execution, delivery follow-up, and vendor performance evaluation.</w:t>
       </w:r>
     </w:p>
     <w:p>
       <w:pPr>
-        <w:spacing w:after="15" w:line="251" w:lineRule="exact"/>
-        <w:ind w:left="317" w:hanging="202"/>
-        <w:jc w:val="left"/>
+        <w:keepNext w:val="0"/>
+        <w:keepLines w:val="0"/>
+        <w:pageBreakBefore w:val="0"/>
+        <w:widowControl w:val="0"/>
+        <w:spacing w:before="0" w:after="16" w:line="240" w:lineRule="auto"/>
+        <w:ind w:left="230" w:hanging="187"/>
       </w:pPr>
       <w:r>
         <w:rPr>
-          <w:rFonts w:ascii="Aptos" w:hAnsi="Aptos" w:eastAsia="Aptos"/>
+          <w:rFonts w:ascii="Calibri" w:hAnsi="Calibri" w:eastAsia="Calibri"/>
           <w:b w:val="0"/>
-          <w:i w:val="0"/>
-          <w:color w:val="1F2937"/>
-          <w:sz w:val="18"/>
+          <w:color w:val="1F1F1F"/>
+          <w:sz w:val="20"/>
         </w:rPr>
         <w:t xml:space="preserve">• </w:t>
       </w:r>
       <w:r>
         <w:rPr>
-          <w:rFonts w:ascii="Aptos" w:hAnsi="Aptos" w:eastAsia="Aptos"/>
+          <w:rFonts w:ascii="Calibri" w:hAnsi="Calibri" w:eastAsia="Calibri"/>
           <w:b w:val="0"/>
-          <w:i w:val="0"/>
-          <w:color w:val="1F2937"/>
-          <w:sz w:val="18"/>
+          <w:color w:val="1F1F1F"/>
+          <w:sz w:val="20"/>
+        </w:rPr>
+        <w:t>Established supplier review and assessment processes aligned with Bosch Rexroth procurement standards, supporting compliant and scalable purchasing operations in a fast-changing startup environment.</w:t>
+      </w:r>
+    </w:p>
+    <w:p>
+      <w:pPr>
+        <w:keepNext w:val="0"/>
+        <w:keepLines w:val="0"/>
+        <w:pageBreakBefore w:val="0"/>
+        <w:widowControl w:val="0"/>
+        <w:spacing w:before="0" w:after="16" w:line="240" w:lineRule="auto"/>
+        <w:ind w:left="230" w:hanging="187"/>
+      </w:pPr>
+      <w:r>
+        <w:rPr>
+          <w:rFonts w:ascii="Calibri" w:hAnsi="Calibri" w:eastAsia="Calibri"/>
+          <w:b w:val="0"/>
+          <w:color w:val="1F1F1F"/>
+          <w:sz w:val="20"/>
+        </w:rPr>
+        <w:t xml:space="preserve">• </w:t>
+      </w:r>
+      <w:r>
+        <w:rPr>
+          <w:rFonts w:ascii="Calibri" w:hAnsi="Calibri" w:eastAsia="Calibri"/>
+          <w:b w:val="0"/>
+          <w:color w:val="1F1F1F"/>
+          <w:sz w:val="20"/>
+        </w:rPr>
+        <w:t>Coordinated procurement for business-critical and relocation-related requirements, including large-scale office equipment and workplace setup, ensuring validated demand, controlled purchasing, and on-time delivery.</w:t>
+      </w:r>
+    </w:p>
+    <w:p>
+      <w:pPr>
+        <w:keepNext w:val="0"/>
+        <w:keepLines w:val="0"/>
+        <w:pageBreakBefore w:val="0"/>
+        <w:widowControl w:val="0"/>
+        <w:spacing w:before="0" w:after="16" w:line="240" w:lineRule="auto"/>
+        <w:ind w:left="230" w:hanging="187"/>
+      </w:pPr>
+      <w:r>
+        <w:rPr>
+          <w:rFonts w:ascii="Calibri" w:hAnsi="Calibri" w:eastAsia="Calibri"/>
+          <w:b w:val="0"/>
+          <w:color w:val="1F1F1F"/>
+          <w:sz w:val="20"/>
+        </w:rPr>
+        <w:t xml:space="preserve">• </w:t>
+      </w:r>
+      <w:r>
+        <w:rPr>
+          <w:rFonts w:ascii="Calibri" w:hAnsi="Calibri" w:eastAsia="Calibri"/>
+          <w:b w:val="0"/>
+          <w:color w:val="1F1F1F"/>
+          <w:sz w:val="20"/>
+        </w:rPr>
+        <w:t>Drove supplier follow-up and delivery recovery while partnering cross-functionally to resolve supply issues, maintain operational continuity, and support company build-out.</w:t>
+      </w:r>
+    </w:p>
+    <w:p>
+      <w:pPr>
+        <w:keepNext w:val="0"/>
+        <w:keepLines w:val="0"/>
+        <w:pageBreakBefore w:val="0"/>
+        <w:widowControl w:val="0"/>
+        <w:spacing w:before="16" w:after="8" w:line="240" w:lineRule="auto"/>
+        <w:ind w:left="0"/>
+        <w:jc w:val="left"/>
+      </w:pPr>
+      <w:r>
+        <w:rPr>
+          <w:rFonts w:ascii="Calibri" w:hAnsi="Calibri" w:eastAsia="Calibri"/>
+          <w:b/>
+          <w:color w:val="1F1F1F"/>
+          <w:sz w:val="20"/>
+        </w:rPr>
+        <w:t>Senior Business Representative, Winbond Integrated Circuit (Suzhou) Co., Ltd | 2018 - 2022</w:t>
+      </w:r>
+    </w:p>
+    <w:p>
+      <w:pPr>
+        <w:keepNext w:val="0"/>
+        <w:keepLines w:val="0"/>
+        <w:pageBreakBefore w:val="0"/>
+        <w:widowControl w:val="0"/>
+        <w:spacing w:before="0" w:after="16" w:line="240" w:lineRule="auto"/>
+        <w:ind w:left="230" w:hanging="187"/>
+      </w:pPr>
+      <w:r>
+        <w:rPr>
+          <w:rFonts w:ascii="Calibri" w:hAnsi="Calibri" w:eastAsia="Calibri"/>
+          <w:b w:val="0"/>
+          <w:color w:val="1F1F1F"/>
+          <w:sz w:val="20"/>
+        </w:rPr>
+        <w:t xml:space="preserve">• </w:t>
+      </w:r>
+      <w:r>
+        <w:rPr>
+          <w:rFonts w:ascii="Calibri" w:hAnsi="Calibri" w:eastAsia="Calibri"/>
+          <w:b w:val="0"/>
+          <w:color w:val="1F1F1F"/>
+          <w:sz w:val="20"/>
+        </w:rPr>
+        <w:t>Improved on-time delivery by 25% by aligning supply planning with customer demand, factory constraints, and R&amp;D priorities across IoT, wearables, and networking product lines.</w:t>
+      </w:r>
+    </w:p>
+    <w:p>
+      <w:pPr>
+        <w:keepNext w:val="0"/>
+        <w:keepLines w:val="0"/>
+        <w:pageBreakBefore w:val="0"/>
+        <w:widowControl w:val="0"/>
+        <w:spacing w:before="0" w:after="16" w:line="240" w:lineRule="auto"/>
+        <w:ind w:left="230" w:hanging="187"/>
+      </w:pPr>
+      <w:r>
+        <w:rPr>
+          <w:rFonts w:ascii="Calibri" w:hAnsi="Calibri" w:eastAsia="Calibri"/>
+          <w:b w:val="0"/>
+          <w:color w:val="1F1F1F"/>
+          <w:sz w:val="20"/>
+        </w:rPr>
+        <w:t xml:space="preserve">• </w:t>
+      </w:r>
+      <w:r>
+        <w:rPr>
+          <w:rFonts w:ascii="Calibri" w:hAnsi="Calibri" w:eastAsia="Calibri"/>
+          <w:b w:val="0"/>
+          <w:color w:val="1F1F1F"/>
+          <w:sz w:val="20"/>
         </w:rPr>
         <w:t>Coordinated cross-functional teams to resolve customer, roadmap, and supply issues across IoT, wearables, and networking product lines.</w:t>
       </w:r>
     </w:p>
     <w:p>
       <w:pPr>
-        <w:spacing w:before="0" w:after="3" w:line="247" w:lineRule="exact"/>
+        <w:keepNext w:val="0"/>
+        <w:keepLines w:val="0"/>
+        <w:pageBreakBefore w:val="0"/>
+        <w:widowControl w:val="0"/>
+        <w:spacing w:before="16" w:after="8" w:line="240" w:lineRule="auto"/>
+        <w:ind w:left="0"/>
         <w:jc w:val="left"/>
       </w:pPr>
       <w:r>
         <w:rPr>
-          <w:rFonts w:ascii="Aptos" w:hAnsi="Aptos" w:eastAsia="Aptos"/>
+          <w:rFonts w:ascii="Calibri" w:hAnsi="Calibri" w:eastAsia="Calibri"/>
           <w:b/>
-          <w:i w:val="0"/>
-          <w:color w:val="1F2937"/>
-          <w:sz w:val="18"/>
+          <w:color w:val="1F1F1F"/>
+          <w:sz w:val="20"/>
         </w:rPr>
-        <w:t>Resource Development Manager</w:t>
-      </w:r>
-      <w:r>
-        <w:rPr>
-          <w:rFonts w:ascii="Aptos" w:hAnsi="Aptos" w:eastAsia="Aptos"/>
-          <w:b w:val="0"/>
-          <w:i w:val="0"/>
-          <w:color w:val="1F2937"/>
-          <w:sz w:val="18"/>
-        </w:rPr>
-        <w:t>, Shanghai Uniscope Electronics Co., Ltd | 2009-2018</w:t>
+        <w:t>Resource Development Manager, Shanghai Uniscope Electronics Co., Ltd | 2009 - 2018</w:t>
       </w:r>
     </w:p>
     <w:p>
       <w:pPr>
-        <w:spacing w:after="15" w:line="251" w:lineRule="exact"/>
-        <w:ind w:left="317" w:hanging="202"/>
-        <w:jc w:val="left"/>
+        <w:keepNext w:val="0"/>
+        <w:keepLines w:val="0"/>
+        <w:pageBreakBefore w:val="0"/>
+        <w:widowControl w:val="0"/>
+        <w:spacing w:before="0" w:after="16" w:line="240" w:lineRule="auto"/>
+        <w:ind w:left="230" w:hanging="187"/>
       </w:pPr>
       <w:r>
         <w:rPr>
-          <w:rFonts w:ascii="Aptos" w:hAnsi="Aptos" w:eastAsia="Aptos"/>
+          <w:rFonts w:ascii="Calibri" w:hAnsi="Calibri" w:eastAsia="Calibri"/>
           <w:b w:val="0"/>
-          <w:i w:val="0"/>
-          <w:color w:val="1F2937"/>
-          <w:sz w:val="18"/>
+          <w:color w:val="1F1F1F"/>
+          <w:sz w:val="20"/>
         </w:rPr>
         <w:t xml:space="preserve">• </w:t>
       </w:r>
       <w:r>
         <w:rPr>
-          <w:rFonts w:ascii="Aptos" w:hAnsi="Aptos" w:eastAsia="Aptos"/>
+          <w:rFonts w:ascii="Calibri" w:hAnsi="Calibri" w:eastAsia="Calibri"/>
           <w:b w:val="0"/>
-          <w:i w:val="0"/>
-          <w:color w:val="1F2937"/>
-          <w:sz w:val="18"/>
+          <w:color w:val="1F1F1F"/>
+          <w:sz w:val="20"/>
         </w:rPr>
-        <w:t xml:space="preserve">Increased operational efficiency by </w:t>
-      </w:r>
-      <w:r>
-        <w:rPr>
-          <w:rFonts w:ascii="Aptos" w:hAnsi="Aptos" w:eastAsia="Aptos"/>
-          <w:b/>
-          <w:i w:val="0"/>
-          <w:color w:val="1F2937"/>
-          <w:sz w:val="18"/>
-        </w:rPr>
-        <w:t>20%</w:t>
-      </w:r>
-      <w:r>
-        <w:rPr>
-          <w:rFonts w:ascii="Aptos" w:hAnsi="Aptos" w:eastAsia="Aptos"/>
-          <w:b w:val="0"/>
-          <w:i w:val="0"/>
-          <w:color w:val="1F2937"/>
-          <w:sz w:val="18"/>
-        </w:rPr>
-        <w:t xml:space="preserve">, reduced procurement costs by </w:t>
-      </w:r>
-      <w:r>
-        <w:rPr>
-          <w:rFonts w:ascii="Aptos" w:hAnsi="Aptos" w:eastAsia="Aptos"/>
-          <w:b/>
-          <w:i w:val="0"/>
-          <w:color w:val="1F2937"/>
-          <w:sz w:val="18"/>
-        </w:rPr>
-        <w:t>5%</w:t>
-      </w:r>
-      <w:r>
-        <w:rPr>
-          <w:rFonts w:ascii="Aptos" w:hAnsi="Aptos" w:eastAsia="Aptos"/>
-          <w:b w:val="0"/>
-          <w:i w:val="0"/>
-          <w:color w:val="1F2937"/>
-          <w:sz w:val="18"/>
-        </w:rPr>
-        <w:t xml:space="preserve">, and shortened lead times by </w:t>
-      </w:r>
-      <w:r>
-        <w:rPr>
-          <w:rFonts w:ascii="Aptos" w:hAnsi="Aptos" w:eastAsia="Aptos"/>
-          <w:b/>
-          <w:i w:val="0"/>
-          <w:color w:val="1F2937"/>
-          <w:sz w:val="18"/>
-        </w:rPr>
-        <w:t>15%</w:t>
-      </w:r>
-      <w:r>
-        <w:rPr>
-          <w:rFonts w:ascii="Aptos" w:hAnsi="Aptos" w:eastAsia="Aptos"/>
-          <w:b w:val="0"/>
-          <w:i w:val="0"/>
-          <w:color w:val="1F2937"/>
-          <w:sz w:val="18"/>
-        </w:rPr>
-        <w:t xml:space="preserve"> by improving supplier management, shortage response, and purchasing workflows.</w:t>
+        <w:t>Increased operational efficiency by 20%, reduced procurement costs by 5%, and shortened lead times by 15% by improving supplier management, shortage response, and purchasing workflows.</w:t>
       </w:r>
     </w:p>
     <w:p>
       <w:pPr>
-        <w:spacing w:after="15" w:line="251" w:lineRule="exact"/>
-        <w:ind w:left="317" w:hanging="202"/>
-        <w:jc w:val="left"/>
+        <w:keepNext w:val="0"/>
+        <w:keepLines w:val="0"/>
+        <w:pageBreakBefore w:val="0"/>
+        <w:widowControl w:val="0"/>
+        <w:spacing w:before="0" w:after="16" w:line="240" w:lineRule="auto"/>
+        <w:ind w:left="230" w:hanging="187"/>
       </w:pPr>
       <w:r>
         <w:rPr>
-          <w:rFonts w:ascii="Aptos" w:hAnsi="Aptos" w:eastAsia="Aptos"/>
+          <w:rFonts w:ascii="Calibri" w:hAnsi="Calibri" w:eastAsia="Calibri"/>
           <w:b w:val="0"/>
-          <w:i w:val="0"/>
-          <w:color w:val="1F2937"/>
-          <w:sz w:val="18"/>
+          <w:color w:val="1F1F1F"/>
+          <w:sz w:val="20"/>
         </w:rPr>
         <w:t xml:space="preserve">• </w:t>
       </w:r>
       <w:r>
         <w:rPr>
-          <w:rFonts w:ascii="Aptos" w:hAnsi="Aptos" w:eastAsia="Aptos"/>
+          <w:rFonts w:ascii="Calibri" w:hAnsi="Calibri" w:eastAsia="Calibri"/>
           <w:b w:val="0"/>
-          <w:i w:val="0"/>
-          <w:color w:val="1F2937"/>
-          <w:sz w:val="18"/>
+          <w:color w:val="1F1F1F"/>
+          <w:sz w:val="20"/>
         </w:rPr>
-        <w:t xml:space="preserve">Reduced supply-chain disruptions by </w:t>
-      </w:r>
-      <w:r>
-        <w:rPr>
-          <w:rFonts w:ascii="Aptos" w:hAnsi="Aptos" w:eastAsia="Aptos"/>
-          <w:b/>
-          <w:i w:val="0"/>
-          <w:color w:val="1F2937"/>
-          <w:sz w:val="18"/>
-        </w:rPr>
-        <w:t>8%</w:t>
-      </w:r>
-      <w:r>
-        <w:rPr>
-          <w:rFonts w:ascii="Aptos" w:hAnsi="Aptos" w:eastAsia="Aptos"/>
-          <w:b w:val="0"/>
-          <w:i w:val="0"/>
-          <w:color w:val="1F2937"/>
-          <w:sz w:val="18"/>
-        </w:rPr>
-        <w:t xml:space="preserve"> and improved supplier performance by </w:t>
-      </w:r>
-      <w:r>
-        <w:rPr>
-          <w:rFonts w:ascii="Aptos" w:hAnsi="Aptos" w:eastAsia="Aptos"/>
-          <w:b/>
-          <w:i w:val="0"/>
-          <w:color w:val="1F2937"/>
-          <w:sz w:val="18"/>
-        </w:rPr>
-        <w:t>10%</w:t>
-      </w:r>
-      <w:r>
-        <w:rPr>
-          <w:rFonts w:ascii="Aptos" w:hAnsi="Aptos" w:eastAsia="Aptos"/>
-          <w:b w:val="0"/>
-          <w:i w:val="0"/>
-          <w:color w:val="1F2937"/>
-          <w:sz w:val="18"/>
-        </w:rPr>
-        <w:t xml:space="preserve"> through stronger vendor management, inventory control, and escalation handling.</w:t>
+        <w:t>Reduced supply-chain disruptions by 8% and improved supplier performance by 10% through stronger vendor management, inventory control, and escalation handling.</w:t>
       </w:r>
     </w:p>
     <w:sectPr>
       <w:pgSz w:w="12240" w:h="15840"/>
-      <w:pgMar w:top="662" w:right="806" w:bottom="662" w:left="806" w:header="720" w:footer="720" w:gutter="0"/>
+      <w:pgMar w:top="662" w:right="720" w:bottom="605" w:left="720" w:header="720" w:footer="720" w:gutter="0"/>
       <w:cols w:space="720"/>
       <w:docGrid w:linePitch="360"/>
     </w:sectPr>
@@ -1336,13 +1182,9 @@
     <w:name w:val="Normal"/>
     <w:qFormat/>
     <w:rsid w:val="00FC693F"/>
-    <w:pPr>
-      <w:spacing w:before="0" w:after="20" w:line="254" w:lineRule="exact"/>
-    </w:pPr>
     <w:rPr>
-      <w:rFonts w:ascii="Aptos" w:hAnsi="Aptos" w:eastAsia="Aptos"/>
-      <w:color w:val="1F2937"/>
-      <w:sz w:val="18"/>
+      <w:rFonts w:ascii="Calibri" w:hAnsi="Calibri" w:eastAsia="Calibri"/>
+      <w:sz w:val="20"/>
     </w:rPr>
   </w:style>
   <w:style w:type="paragraph" w:styleId="Header">

</xml_diff>